<commit_message>
Update Documento - Projeto de Extensão - COM Empresa - 2026_1.docx
</commit_message>
<xml_diff>
--- a/Documento - Projeto de Extensão - COM Empresa - 2026_1.docx
+++ b/Documento - Projeto de Extensão - COM Empresa - 2026_1.docx
@@ -135,7 +135,6 @@
             <w:pPr>
               <w:rPr>
                 <w:rFonts w:ascii="Arial" w:eastAsia="Arial" w:hAnsi="Arial" w:cs="Arial"/>
-                <w:color w:val="0C3512" w:themeColor="accent3" w:themeShade="80"/>
                 <w:sz w:val="20"/>
                 <w:szCs w:val="20"/>
               </w:rPr>
@@ -143,21 +142,11 @@
             <w:r>
               <w:rPr>
                 <w:rFonts w:ascii="Arial" w:eastAsia="Arial" w:hAnsi="Arial" w:cs="Arial"/>
-                <w:color w:val="0C3512" w:themeColor="accent3" w:themeShade="80"/>
-                <w:sz w:val="20"/>
-                <w:szCs w:val="20"/>
-              </w:rPr>
-              <w:t>Inserir os dados neste espaço. Orientações: descrição sucinta englobando o tema do projeto.</w:t>
-            </w:r>
-          </w:p>
-          <w:p>
-            <w:pPr>
-              <w:rPr>
-                <w:rFonts w:ascii="Arial" w:eastAsia="Arial" w:hAnsi="Arial" w:cs="Arial"/>
-                <w:sz w:val="20"/>
-                <w:szCs w:val="20"/>
-              </w:rPr>
-            </w:pPr>
+                <w:sz w:val="20"/>
+                <w:szCs w:val="20"/>
+              </w:rPr>
+              <w:t>Desenvolvimento de um Protótipo Navegável para a Plataforma TicketLab</w:t>
+            </w:r>
           </w:p>
         </w:tc>
       </w:tr>
@@ -173,27 +162,6 @@
           <w:szCs w:val="20"/>
         </w:rPr>
       </w:pPr>
-    </w:p>
-    <w:p>
-      <w:pPr>
-        <w:spacing w:after="0" w:line="240" w:lineRule="auto"/>
-        <w:jc w:val="both"/>
-        <w:rPr>
-          <w:rFonts w:ascii="Arial" w:eastAsia="Arial" w:hAnsi="Arial" w:cs="Arial"/>
-          <w:b/>
-          <w:sz w:val="20"/>
-          <w:szCs w:val="20"/>
-        </w:rPr>
-      </w:pPr>
-      <w:r>
-        <w:rPr>
-          <w:rFonts w:ascii="Arial" w:eastAsia="Arial" w:hAnsi="Arial" w:cs="Arial"/>
-          <w:b/>
-          <w:sz w:val="20"/>
-          <w:szCs w:val="20"/>
-        </w:rPr>
-        <w:t>Integrantes da equipe</w:t>
-      </w:r>
     </w:p>
     <w:p>
       <w:pPr>
@@ -218,11 +186,10 @@
         <w:rPr>
           <w:rFonts w:ascii="Arial" w:eastAsia="Arial" w:hAnsi="Arial" w:cs="Arial"/>
           <w:b/>
-          <w:color w:val="0C3512" w:themeColor="accent3" w:themeShade="80"/>
-          <w:sz w:val="16"/>
-          <w:szCs w:val="16"/>
-        </w:rPr>
-        <w:t>Identificar o nome completo e o RA dos participantes do projeto</w:t>
+          <w:sz w:val="20"/>
+          <w:szCs w:val="20"/>
+        </w:rPr>
+        <w:t>Integrantes da equipe</w:t>
       </w:r>
     </w:p>
     <w:tbl>
@@ -315,7 +282,6 @@
               <w:spacing w:after="0" w:line="240" w:lineRule="auto"/>
               <w:rPr>
                 <w:rFonts w:ascii="Arial" w:eastAsia="Arial" w:hAnsi="Arial" w:cs="Arial"/>
-                <w:color w:val="0C3512" w:themeColor="accent3" w:themeShade="80"/>
                 <w:sz w:val="20"/>
                 <w:szCs w:val="20"/>
               </w:rPr>
@@ -323,11 +289,10 @@
             <w:r>
               <w:rPr>
                 <w:rFonts w:ascii="Arial" w:eastAsia="Arial" w:hAnsi="Arial" w:cs="Arial"/>
-                <w:color w:val="0C3512" w:themeColor="accent3" w:themeShade="80"/>
-                <w:sz w:val="20"/>
-                <w:szCs w:val="20"/>
-              </w:rPr>
-              <w:t>Preencher aqui</w:t>
+                <w:sz w:val="20"/>
+                <w:szCs w:val="20"/>
+              </w:rPr>
+              <w:t>Max Tocantins Quaglia</w:t>
             </w:r>
           </w:p>
           <w:p>
@@ -351,11 +316,20 @@
               <w:spacing w:after="0" w:line="240" w:lineRule="auto"/>
               <w:rPr>
                 <w:rFonts w:ascii="Arial" w:eastAsia="Arial" w:hAnsi="Arial" w:cs="Arial"/>
-                <w:b/>
+                <w:bCs/>
                 <w:sz w:val="20"/>
                 <w:szCs w:val="20"/>
               </w:rPr>
             </w:pPr>
+            <w:r>
+              <w:rPr>
+                <w:rFonts w:ascii="Arial" w:eastAsia="Arial" w:hAnsi="Arial" w:cs="Arial"/>
+                <w:bCs/>
+                <w:sz w:val="20"/>
+                <w:szCs w:val="20"/>
+              </w:rPr>
+              <w:t>26028815</w:t>
+            </w:r>
           </w:p>
         </w:tc>
       </w:tr>
@@ -369,18 +343,36 @@
               <w:spacing w:after="0" w:line="240" w:lineRule="auto"/>
               <w:rPr>
                 <w:rFonts w:ascii="Arial" w:eastAsia="Arial" w:hAnsi="Arial" w:cs="Arial"/>
-                <w:b/>
+                <w:bCs/>
                 <w:sz w:val="20"/>
                 <w:szCs w:val="20"/>
               </w:rPr>
             </w:pPr>
+            <w:r>
+              <w:rPr>
+                <w:rFonts w:ascii="Arial" w:eastAsia="Arial" w:hAnsi="Arial" w:cs="Arial"/>
+                <w:bCs/>
+                <w:sz w:val="20"/>
+                <w:szCs w:val="20"/>
+              </w:rPr>
+              <w:t xml:space="preserve">Brian </w:t>
+            </w:r>
+            <w:r>
+              <w:rPr>
+                <w:rFonts w:ascii="Arial" w:eastAsia="Arial" w:hAnsi="Arial" w:cs="Arial"/>
+                <w:bCs/>
+                <w:sz w:val="20"/>
+                <w:szCs w:val="20"/>
+              </w:rPr>
+              <w:t>Walter</w:t>
+            </w:r>
           </w:p>
           <w:p>
             <w:pPr>
               <w:spacing w:after="0" w:line="240" w:lineRule="auto"/>
               <w:rPr>
                 <w:rFonts w:ascii="Arial" w:eastAsia="Arial" w:hAnsi="Arial" w:cs="Arial"/>
-                <w:b/>
+                <w:bCs/>
                 <w:sz w:val="20"/>
                 <w:szCs w:val="20"/>
               </w:rPr>
@@ -396,11 +388,20 @@
               <w:spacing w:after="0" w:line="240" w:lineRule="auto"/>
               <w:rPr>
                 <w:rFonts w:ascii="Arial" w:eastAsia="Arial" w:hAnsi="Arial" w:cs="Arial"/>
-                <w:b/>
+                <w:bCs/>
                 <w:sz w:val="20"/>
                 <w:szCs w:val="20"/>
               </w:rPr>
             </w:pPr>
+            <w:r>
+              <w:rPr>
+                <w:rFonts w:ascii="Arial" w:eastAsia="Arial" w:hAnsi="Arial" w:cs="Arial"/>
+                <w:bCs/>
+                <w:sz w:val="20"/>
+                <w:szCs w:val="20"/>
+              </w:rPr>
+              <w:t>26029367</w:t>
+            </w:r>
           </w:p>
         </w:tc>
       </w:tr>
@@ -414,11 +415,20 @@
               <w:spacing w:after="0" w:line="240" w:lineRule="auto"/>
               <w:rPr>
                 <w:rFonts w:ascii="Arial" w:eastAsia="Arial" w:hAnsi="Arial" w:cs="Arial"/>
-                <w:b/>
+                <w:bCs/>
                 <w:sz w:val="20"/>
                 <w:szCs w:val="20"/>
               </w:rPr>
             </w:pPr>
+            <w:r>
+              <w:rPr>
+                <w:rFonts w:ascii="Arial" w:eastAsia="Arial" w:hAnsi="Arial" w:cs="Arial"/>
+                <w:bCs/>
+                <w:sz w:val="20"/>
+                <w:szCs w:val="20"/>
+              </w:rPr>
+              <w:t>Rafael Della Pietra Nhoncanse</w:t>
+            </w:r>
           </w:p>
           <w:p>
             <w:pPr>
@@ -441,11 +451,20 @@
               <w:spacing w:after="0" w:line="240" w:lineRule="auto"/>
               <w:rPr>
                 <w:rFonts w:ascii="Arial" w:eastAsia="Arial" w:hAnsi="Arial" w:cs="Arial"/>
-                <w:b/>
+                <w:bCs/>
                 <w:sz w:val="20"/>
                 <w:szCs w:val="20"/>
               </w:rPr>
             </w:pPr>
+            <w:r>
+              <w:rPr>
+                <w:rFonts w:ascii="Arial" w:eastAsia="Arial" w:hAnsi="Arial" w:cs="Arial"/>
+                <w:bCs/>
+                <w:sz w:val="20"/>
+                <w:szCs w:val="20"/>
+              </w:rPr>
+              <w:t>26028462</w:t>
+            </w:r>
           </w:p>
         </w:tc>
       </w:tr>
@@ -590,21 +609,10 @@
             <w:r>
               <w:rPr>
                 <w:rFonts w:ascii="Arial" w:eastAsia="Arial" w:hAnsi="Arial" w:cs="Arial"/>
-                <w:color w:val="0C3512" w:themeColor="accent3" w:themeShade="80"/>
-                <w:sz w:val="20"/>
-                <w:szCs w:val="20"/>
-              </w:rPr>
-              <w:t>Inserir os dados neste espaço. Orientações: inserir o nome completo do professor responsável pela Atividade de Extensão.</w:t>
-            </w:r>
-            <w:r>
-              <w:rPr>
-                <w:rFonts w:ascii="Arial" w:eastAsia="Arial" w:hAnsi="Arial" w:cs="Arial"/>
-                <w:b/>
-                <w:color w:val="0C3512" w:themeColor="accent3" w:themeShade="80"/>
-                <w:sz w:val="16"/>
-                <w:szCs w:val="16"/>
-              </w:rPr>
-              <w:t xml:space="preserve"> </w:t>
+                <w:sz w:val="20"/>
+                <w:szCs w:val="20"/>
+              </w:rPr>
+              <w:t>David De Oliveira Lemes</w:t>
             </w:r>
           </w:p>
         </w:tc>
@@ -704,30 +712,10 @@
             <w:r>
               <w:rPr>
                 <w:rFonts w:ascii="Arial" w:eastAsia="Arial" w:hAnsi="Arial" w:cs="Arial"/>
-                <w:color w:val="0C3512" w:themeColor="accent3" w:themeShade="80"/>
-                <w:sz w:val="20"/>
-                <w:szCs w:val="20"/>
-              </w:rPr>
-              <w:t>Inserir os dados neste espaço. Orientações:</w:t>
-            </w:r>
-            <w:r>
-              <w:rPr>
-                <w:rFonts w:ascii="Arial" w:eastAsia="Arial" w:hAnsi="Arial" w:cs="Arial"/>
-                <w:b/>
-                <w:color w:val="0C3512" w:themeColor="accent3" w:themeShade="80"/>
-                <w:sz w:val="16"/>
-                <w:szCs w:val="16"/>
-              </w:rPr>
-              <w:t xml:space="preserve"> </w:t>
-            </w:r>
-            <w:r>
-              <w:rPr>
-                <w:rFonts w:ascii="Arial" w:eastAsia="Arial" w:hAnsi="Arial" w:cs="Arial"/>
-                <w:color w:val="0C3512" w:themeColor="accent3" w:themeShade="80"/>
-                <w:sz w:val="20"/>
-                <w:szCs w:val="20"/>
-              </w:rPr>
-              <w:t>inserir o nome do curso de graduação.</w:t>
+                <w:sz w:val="20"/>
+                <w:szCs w:val="20"/>
+              </w:rPr>
+              <w:t xml:space="preserve">Ciências da Computação </w:t>
             </w:r>
           </w:p>
         </w:tc>
@@ -760,6 +748,7 @@
         <w:rPr>
           <w:rFonts w:ascii="Arial" w:eastAsia="Arial" w:hAnsi="Arial" w:cs="Arial"/>
           <w:b/>
+          <w:color w:val="0C3512" w:themeColor="accent3" w:themeShade="80"/>
           <w:sz w:val="20"/>
           <w:szCs w:val="20"/>
         </w:rPr>
@@ -773,44 +762,15 @@
         </w:rPr>
         <w:t>Linha de atuação</w:t>
       </w:r>
-    </w:p>
-    <w:p>
-      <w:pPr>
-        <w:spacing w:after="0" w:line="240" w:lineRule="auto"/>
-        <w:jc w:val="both"/>
-        <w:rPr>
-          <w:rFonts w:ascii="Arial" w:eastAsia="Arial" w:hAnsi="Arial" w:cs="Arial"/>
-          <w:b/>
-          <w:color w:val="0C3512" w:themeColor="accent3" w:themeShade="80"/>
-          <w:sz w:val="20"/>
-          <w:szCs w:val="20"/>
-        </w:rPr>
-      </w:pPr>
       <w:r>
         <w:rPr>
-          <w:rFonts w:ascii="Arial Unicode MS" w:eastAsia="Arial Unicode MS" w:hAnsi="Arial Unicode MS" w:cs="Arial Unicode MS"/>
+          <w:rFonts w:ascii="Arial" w:eastAsia="Arial" w:hAnsi="Arial" w:cs="Arial"/>
           <w:b/>
           <w:color w:val="0C3512" w:themeColor="accent3" w:themeShade="80"/>
           <w:sz w:val="16"/>
           <w:szCs w:val="16"/>
         </w:rPr>
-        <w:t>Identificar com ✓ uma ou mais linhas de atuação conforme</w:t>
-      </w:r>
-      <w:r>
-        <w:rPr>
-          <w:color w:val="0C3512" w:themeColor="accent3" w:themeShade="80"/>
-        </w:rPr>
         <w:t xml:space="preserve"> </w:t>
-      </w:r>
-      <w:r>
-        <w:rPr>
-          <w:rFonts w:ascii="Arial" w:eastAsia="Arial" w:hAnsi="Arial" w:cs="Arial"/>
-          <w:b/>
-          <w:color w:val="0C3512" w:themeColor="accent3" w:themeShade="80"/>
-          <w:sz w:val="16"/>
-          <w:szCs w:val="16"/>
-        </w:rPr>
-        <w:t xml:space="preserve">projeto pedagógico de curso. </w:t>
       </w:r>
     </w:p>
     <w:tbl>
@@ -898,6 +858,16 @@
                 <w:szCs w:val="20"/>
               </w:rPr>
             </w:pPr>
+            <w:r>
+              <w:rPr>
+                <w:rFonts w:ascii="Segoe UI Symbol" w:eastAsia="Arial Unicode MS" w:hAnsi="Segoe UI Symbol" w:cs="Segoe UI Symbol"/>
+                <w:b/>
+                <w:color w:val="0C3512" w:themeColor="accent3" w:themeShade="80"/>
+                <w:sz w:val="16"/>
+                <w:szCs w:val="16"/>
+              </w:rPr>
+              <w:t>✓</w:t>
+            </w:r>
           </w:p>
           <w:p>
             <w:pPr>
@@ -939,27 +909,6 @@
         <w:rPr>
           <w:rFonts w:ascii="Arial" w:eastAsia="Arial" w:hAnsi="Arial" w:cs="Arial"/>
           <w:b/>
-          <w:sz w:val="20"/>
-          <w:szCs w:val="20"/>
-        </w:rPr>
-      </w:pPr>
-      <w:r>
-        <w:rPr>
-          <w:rFonts w:ascii="Arial" w:eastAsia="Arial" w:hAnsi="Arial" w:cs="Arial"/>
-          <w:b/>
-          <w:sz w:val="20"/>
-          <w:szCs w:val="20"/>
-        </w:rPr>
-        <w:t>Tipo de projeto</w:t>
-      </w:r>
-    </w:p>
-    <w:p>
-      <w:pPr>
-        <w:spacing w:after="0" w:line="240" w:lineRule="auto"/>
-        <w:jc w:val="both"/>
-        <w:rPr>
-          <w:rFonts w:ascii="Arial" w:eastAsia="Arial" w:hAnsi="Arial" w:cs="Arial"/>
-          <w:b/>
           <w:color w:val="0C3512" w:themeColor="accent3" w:themeShade="80"/>
           <w:sz w:val="16"/>
           <w:szCs w:val="16"/>
@@ -967,13 +916,22 @@
       </w:pPr>
       <w:r>
         <w:rPr>
+          <w:rFonts w:ascii="Arial" w:eastAsia="Arial" w:hAnsi="Arial" w:cs="Arial"/>
+          <w:b/>
+          <w:sz w:val="20"/>
+          <w:szCs w:val="20"/>
+        </w:rPr>
+        <w:t>Tipo de projeto</w:t>
+      </w:r>
+      <w:r>
+        <w:rPr>
           <w:rFonts w:ascii="Arial Unicode MS" w:eastAsia="Arial Unicode MS" w:hAnsi="Arial Unicode MS" w:cs="Arial Unicode MS"/>
           <w:b/>
           <w:color w:val="0C3512" w:themeColor="accent3" w:themeShade="80"/>
           <w:sz w:val="16"/>
           <w:szCs w:val="16"/>
         </w:rPr>
-        <w:t xml:space="preserve">Identificar com ✓ o tipo de projeto. </w:t>
+        <w:t xml:space="preserve"> </w:t>
       </w:r>
     </w:p>
     <w:tbl>
@@ -1043,6 +1001,26 @@
                 <w:szCs w:val="20"/>
               </w:rPr>
               <w:t>Atividade de Extensão implementado na prática (intervenção executada)</w:t>
+            </w:r>
+            <w:r>
+              <w:rPr>
+                <w:rFonts w:ascii="Arial Unicode MS" w:eastAsia="Arial Unicode MS" w:hAnsi="Arial Unicode MS" w:cs="Arial Unicode MS"/>
+                <w:b/>
+                <w:color w:val="0C3512" w:themeColor="accent3" w:themeShade="80"/>
+                <w:sz w:val="16"/>
+                <w:szCs w:val="16"/>
+              </w:rPr>
+              <w:t xml:space="preserve"> </w:t>
+            </w:r>
+            <w:r>
+              <w:rPr>
+                <w:rFonts w:ascii="Segoe UI Symbol" w:eastAsia="Arial Unicode MS" w:hAnsi="Segoe UI Symbol" w:cs="Segoe UI Symbol"/>
+                <w:b/>
+                <w:color w:val="0C3512" w:themeColor="accent3" w:themeShade="80"/>
+                <w:sz w:val="16"/>
+                <w:szCs w:val="16"/>
+              </w:rPr>
+              <w:t>✓</w:t>
             </w:r>
           </w:p>
         </w:tc>
@@ -1118,47 +1096,10 @@
             <w:r>
               <w:rPr>
                 <w:rFonts w:ascii="Arial" w:eastAsia="Arial" w:hAnsi="Arial" w:cs="Arial"/>
-                <w:color w:val="0C3512" w:themeColor="accent3" w:themeShade="80"/>
-                <w:sz w:val="20"/>
-                <w:szCs w:val="20"/>
-              </w:rPr>
-              <w:t xml:space="preserve">Estabelecido conforme </w:t>
-            </w:r>
-            <w:r>
-              <w:rPr>
-                <w:rFonts w:ascii="Arial" w:eastAsia="Arial" w:hAnsi="Arial" w:cs="Arial"/>
-                <w:color w:val="0C3512" w:themeColor="accent3" w:themeShade="80"/>
-                <w:sz w:val="20"/>
-                <w:szCs w:val="20"/>
-              </w:rPr>
-              <w:t>seleção da ODS e dos</w:t>
-            </w:r>
-            <w:r>
-              <w:rPr>
-                <w:rFonts w:ascii="Arial" w:eastAsia="Arial" w:hAnsi="Arial" w:cs="Arial"/>
-                <w:color w:val="0C3512" w:themeColor="accent3" w:themeShade="80"/>
-                <w:sz w:val="20"/>
-                <w:szCs w:val="20"/>
-              </w:rPr>
-              <w:t xml:space="preserve"> conhecimento</w:t>
-            </w:r>
-            <w:r>
-              <w:rPr>
-                <w:rFonts w:ascii="Arial" w:eastAsia="Arial" w:hAnsi="Arial" w:cs="Arial"/>
-                <w:color w:val="0C3512" w:themeColor="accent3" w:themeShade="80"/>
-                <w:sz w:val="20"/>
-                <w:szCs w:val="20"/>
-              </w:rPr>
-              <w:t>s a</w:t>
-            </w:r>
-            <w:r>
-              <w:rPr>
-                <w:rFonts w:ascii="Arial" w:eastAsia="Arial" w:hAnsi="Arial" w:cs="Arial"/>
-                <w:color w:val="0C3512" w:themeColor="accent3" w:themeShade="80"/>
-                <w:sz w:val="20"/>
-                <w:szCs w:val="20"/>
-              </w:rPr>
-              <w:t xml:space="preserve"> serem trabalhados e orientações do docente.</w:t>
+                <w:sz w:val="20"/>
+                <w:szCs w:val="20"/>
+              </w:rPr>
+              <w:t>Desenvolvimento de soluções tecnológicas para facilitar a organização e a gestão de eventos, promovendo a conexão entre organizadores, fornecedores e administradores por meio de uma plataforma digital.</w:t>
             </w:r>
           </w:p>
         </w:tc>
@@ -1175,6 +1116,41 @@
           <w:szCs w:val="20"/>
         </w:rPr>
       </w:pPr>
+    </w:p>
+    <w:p>
+      <w:pPr>
+        <w:spacing w:before="240" w:after="0"/>
+        <w:jc w:val="both"/>
+        <w:rPr>
+          <w:rFonts w:ascii="Arial" w:eastAsia="Arial" w:hAnsi="Arial" w:cs="Arial"/>
+          <w:b/>
+          <w:sz w:val="20"/>
+          <w:szCs w:val="20"/>
+        </w:rPr>
+      </w:pPr>
+    </w:p>
+    <w:p>
+      <w:pPr>
+        <w:spacing w:before="240" w:after="0"/>
+        <w:jc w:val="both"/>
+        <w:rPr>
+          <w:rFonts w:ascii="Arial" w:eastAsia="Arial" w:hAnsi="Arial" w:cs="Arial"/>
+          <w:b/>
+          <w:sz w:val="20"/>
+          <w:szCs w:val="20"/>
+        </w:rPr>
+      </w:pPr>
+    </w:p>
+    <w:p>
+      <w:pPr>
+        <w:spacing w:after="0" w:line="240" w:lineRule="auto"/>
+        <w:rPr>
+          <w:rFonts w:ascii="Arial" w:eastAsia="Arial" w:hAnsi="Arial" w:cs="Arial"/>
+          <w:b/>
+          <w:sz w:val="20"/>
+          <w:szCs w:val="20"/>
+        </w:rPr>
+      </w:pPr>
       <w:r>
         <w:rPr>
           <w:rFonts w:ascii="Arial" w:eastAsia="Arial" w:hAnsi="Arial" w:cs="Arial"/>
@@ -1182,38 +1158,74 @@
           <w:sz w:val="20"/>
           <w:szCs w:val="20"/>
         </w:rPr>
-        <w:t xml:space="preserve"> Produto decorrente do projeto (opcional dependendo do tipo de projeto)</w:t>
+        <w:t>2. IDENTIFICAÇÃO DO CENÁRIO DE INTERVENÇÃO E HIPÓTESES DE SOLUÇÃO</w:t>
+      </w:r>
+    </w:p>
+    <w:p>
+      <w:pPr>
+        <w:spacing w:after="0" w:line="240" w:lineRule="auto"/>
+        <w:rPr>
+          <w:rFonts w:ascii="Arial" w:eastAsia="Arial" w:hAnsi="Arial" w:cs="Arial"/>
+          <w:b/>
+          <w:sz w:val="20"/>
+          <w:szCs w:val="20"/>
+        </w:rPr>
+      </w:pPr>
+    </w:p>
+    <w:p>
+      <w:pPr>
+        <w:spacing w:after="0" w:line="240" w:lineRule="auto"/>
+        <w:rPr>
+          <w:rFonts w:ascii="Arial" w:eastAsia="Arial" w:hAnsi="Arial" w:cs="Arial"/>
+          <w:b/>
+          <w:color w:val="FF3333"/>
+          <w:sz w:val="16"/>
+          <w:szCs w:val="16"/>
+        </w:rPr>
+      </w:pPr>
+      <w:r>
+        <w:rPr>
+          <w:rFonts w:ascii="Arial" w:eastAsia="Arial" w:hAnsi="Arial" w:cs="Arial"/>
+          <w:b/>
+          <w:sz w:val="20"/>
+          <w:szCs w:val="20"/>
+        </w:rPr>
+        <w:t>Local (cenário) previsto para a implementação do projeto</w:t>
       </w:r>
     </w:p>
     <w:tbl>
       <w:tblPr>
-        <w:tblW w:w="9465" w:type="dxa"/>
-        <w:tblInd w:w="44" w:type="dxa"/>
-        <w:tblBorders>
-          <w:top w:val="single" w:sz="4" w:space="0" w:color="000000"/>
-          <w:left w:val="single" w:sz="4" w:space="0" w:color="000000"/>
-          <w:bottom w:val="single" w:sz="4" w:space="0" w:color="000000"/>
-          <w:right w:val="single" w:sz="4" w:space="0" w:color="000000"/>
-          <w:insideH w:val="single" w:sz="4" w:space="0" w:color="000000"/>
-          <w:insideV w:val="single" w:sz="4" w:space="0" w:color="000000"/>
-        </w:tblBorders>
+        <w:tblW w:w="9300" w:type="dxa"/>
         <w:tblLayout w:type="fixed"/>
-        <w:tblLook w:val="0400" w:firstRow="0" w:lastRow="0" w:firstColumn="0" w:lastColumn="0" w:noHBand="0" w:noVBand="1"/>
+        <w:tblLook w:val="0000" w:firstRow="0" w:lastRow="0" w:firstColumn="0" w:lastColumn="0" w:noHBand="0" w:noVBand="0"/>
       </w:tblPr>
       <w:tblGrid>
-        <w:gridCol w:w="9465"/>
+        <w:gridCol w:w="9300"/>
       </w:tblGrid>
       <w:tr>
         <w:tc>
           <w:tcPr>
-            <w:tcW w:w="9465" w:type="dxa"/>
+            <w:tcW w:w="9300" w:type="dxa"/>
+            <w:tcBorders>
+              <w:top w:val="single" w:sz="4" w:space="0" w:color="000000"/>
+              <w:left w:val="single" w:sz="4" w:space="0" w:color="000000"/>
+              <w:bottom w:val="single" w:sz="4" w:space="0" w:color="000000"/>
+              <w:right w:val="single" w:sz="4" w:space="0" w:color="000000"/>
+            </w:tcBorders>
           </w:tcPr>
           <w:p>
             <w:pPr>
-              <w:shd w:val="clear" w:color="auto" w:fill="FFFFFF"/>
-              <w:rPr>
-                <w:rFonts w:ascii="Arial" w:eastAsia="Arial" w:hAnsi="Arial" w:cs="Arial"/>
-                <w:color w:val="0C3512" w:themeColor="accent3" w:themeShade="80"/>
+              <w:pBdr>
+                <w:top w:val="nil"/>
+                <w:left w:val="nil"/>
+                <w:bottom w:val="nil"/>
+                <w:right w:val="nil"/>
+                <w:between w:val="nil"/>
+              </w:pBdr>
+              <w:spacing w:after="0" w:line="240" w:lineRule="auto"/>
+              <w:rPr>
+                <w:rFonts w:ascii="Arial" w:eastAsia="Arial" w:hAnsi="Arial" w:cs="Arial"/>
+                <w:color w:val="FF3333"/>
                 <w:sz w:val="20"/>
                 <w:szCs w:val="20"/>
               </w:rPr>
@@ -1221,82 +1233,38 @@
             <w:r>
               <w:rPr>
                 <w:rFonts w:ascii="Arial" w:eastAsia="Arial" w:hAnsi="Arial" w:cs="Arial"/>
-                <w:color w:val="0C3512" w:themeColor="accent3" w:themeShade="80"/>
-                <w:sz w:val="20"/>
-                <w:szCs w:val="20"/>
-              </w:rPr>
-              <w:t xml:space="preserve">Inserir os dados neste espaço. </w:t>
-            </w:r>
-          </w:p>
-          <w:p>
-            <w:pPr>
-              <w:shd w:val="clear" w:color="auto" w:fill="FFFFFF"/>
-              <w:rPr>
-                <w:rFonts w:ascii="Arial" w:eastAsia="Arial" w:hAnsi="Arial" w:cs="Arial"/>
-                <w:color w:val="0C3512" w:themeColor="accent3" w:themeShade="80"/>
-                <w:sz w:val="20"/>
-                <w:szCs w:val="20"/>
-              </w:rPr>
-            </w:pPr>
-            <w:r>
-              <w:rPr>
-                <w:rFonts w:ascii="Arial" w:eastAsia="Arial" w:hAnsi="Arial" w:cs="Arial"/>
-                <w:color w:val="0C3512" w:themeColor="accent3" w:themeShade="80"/>
-                <w:sz w:val="20"/>
-                <w:szCs w:val="20"/>
-              </w:rPr>
-              <w:t>Orientações:</w:t>
-            </w:r>
-            <w:r>
-              <w:rPr>
-                <w:rFonts w:ascii="Arial" w:eastAsia="Arial" w:hAnsi="Arial" w:cs="Arial"/>
-                <w:b/>
-                <w:color w:val="0C3512" w:themeColor="accent3" w:themeShade="80"/>
-                <w:sz w:val="16"/>
-                <w:szCs w:val="16"/>
-              </w:rPr>
-              <w:t xml:space="preserve"> </w:t>
-            </w:r>
-            <w:r>
-              <w:rPr>
-                <w:rFonts w:ascii="Arial" w:eastAsia="Arial" w:hAnsi="Arial" w:cs="Arial"/>
-                <w:color w:val="0C3512" w:themeColor="accent3" w:themeShade="80"/>
-                <w:sz w:val="20"/>
-                <w:szCs w:val="20"/>
-              </w:rPr>
-              <w:t xml:space="preserve">Descrever o produto decorrente da atividade de Extensão. </w:t>
-            </w:r>
-          </w:p>
-          <w:p>
-            <w:pPr>
-              <w:shd w:val="clear" w:color="auto" w:fill="FFFFFF"/>
-              <w:rPr>
-                <w:rFonts w:ascii="Arial" w:eastAsia="Arial" w:hAnsi="Arial" w:cs="Arial"/>
-                <w:b/>
-                <w:sz w:val="20"/>
-                <w:szCs w:val="20"/>
-              </w:rPr>
-            </w:pPr>
-            <w:r>
-              <w:rPr>
-                <w:rFonts w:ascii="Arial" w:eastAsia="Arial" w:hAnsi="Arial" w:cs="Arial"/>
-                <w:color w:val="0C3512" w:themeColor="accent3" w:themeShade="80"/>
-                <w:sz w:val="20"/>
-                <w:szCs w:val="20"/>
-              </w:rPr>
-              <w:t xml:space="preserve">Apresentar evidências como fotos, links, folder, cartilha, código, </w:t>
-            </w:r>
-            <w:proofErr w:type="gramStart"/>
-            <w:r>
-              <w:rPr>
-                <w:rFonts w:ascii="Arial" w:eastAsia="Arial" w:hAnsi="Arial" w:cs="Arial"/>
-                <w:color w:val="0C3512" w:themeColor="accent3" w:themeShade="80"/>
-                <w:sz w:val="20"/>
-                <w:szCs w:val="20"/>
-              </w:rPr>
-              <w:t>apresentação, etc.</w:t>
-            </w:r>
-            <w:proofErr w:type="gramEnd"/>
+                <w:sz w:val="20"/>
+                <w:szCs w:val="20"/>
+              </w:rPr>
+              <w:t>A plataforma digital TicketLab será destinada a organizadores de eventos, fornecedores e administradores.</w:t>
+            </w:r>
+            <w:r>
+              <w:rPr>
+                <w:rFonts w:ascii="Arial" w:eastAsia="Arial" w:hAnsi="Arial" w:cs="Arial"/>
+                <w:sz w:val="20"/>
+                <w:szCs w:val="20"/>
+              </w:rPr>
+              <w:br/>
+              <w:t>O sistema web permitirá cadastros e acesso às funcionalidades de cada perfil.</w:t>
+            </w:r>
+            <w:r>
+              <w:rPr>
+                <w:rFonts w:ascii="Arial" w:eastAsia="Arial" w:hAnsi="Arial" w:cs="Arial"/>
+                <w:sz w:val="20"/>
+                <w:szCs w:val="20"/>
+              </w:rPr>
+              <w:br/>
+              <w:t>A proposta busca facilitar a organização e o gerenciamento de eventos.</w:t>
+            </w:r>
+            <w:r>
+              <w:rPr>
+                <w:rFonts w:ascii="Arial" w:eastAsia="Arial" w:hAnsi="Arial" w:cs="Arial"/>
+                <w:sz w:val="20"/>
+                <w:szCs w:val="20"/>
+              </w:rPr>
+              <w:br/>
+              <w:t>Inicialmente, o protótipo será testado localmente, com baixo custo de implementação.</w:t>
+            </w:r>
           </w:p>
         </w:tc>
       </w:tr>
@@ -1318,60 +1286,6 @@
         <w:rPr>
           <w:rFonts w:ascii="Arial" w:eastAsia="Arial" w:hAnsi="Arial" w:cs="Arial"/>
           <w:b/>
-          <w:sz w:val="20"/>
-          <w:szCs w:val="20"/>
-        </w:rPr>
-      </w:pPr>
-    </w:p>
-    <w:p>
-      <w:pPr>
-        <w:spacing w:after="0" w:line="240" w:lineRule="auto"/>
-        <w:rPr>
-          <w:rFonts w:ascii="Arial" w:eastAsia="Arial" w:hAnsi="Arial" w:cs="Arial"/>
-          <w:b/>
-          <w:sz w:val="20"/>
-          <w:szCs w:val="20"/>
-        </w:rPr>
-      </w:pPr>
-    </w:p>
-    <w:p>
-      <w:pPr>
-        <w:spacing w:after="0" w:line="240" w:lineRule="auto"/>
-        <w:rPr>
-          <w:rFonts w:ascii="Arial" w:eastAsia="Arial" w:hAnsi="Arial" w:cs="Arial"/>
-          <w:b/>
-          <w:sz w:val="20"/>
-          <w:szCs w:val="20"/>
-        </w:rPr>
-      </w:pPr>
-      <w:r>
-        <w:rPr>
-          <w:rFonts w:ascii="Arial" w:eastAsia="Arial" w:hAnsi="Arial" w:cs="Arial"/>
-          <w:b/>
-          <w:sz w:val="20"/>
-          <w:szCs w:val="20"/>
-        </w:rPr>
-        <w:lastRenderedPageBreak/>
-        <w:t>2. IDENTIFICAÇÃO DO CENÁRIO DE INTERVENÇÃO E HIPÓTESES DE SOLUÇÃO</w:t>
-      </w:r>
-    </w:p>
-    <w:p>
-      <w:pPr>
-        <w:spacing w:after="0" w:line="240" w:lineRule="auto"/>
-        <w:rPr>
-          <w:rFonts w:ascii="Arial" w:eastAsia="Arial" w:hAnsi="Arial" w:cs="Arial"/>
-          <w:b/>
-          <w:sz w:val="20"/>
-          <w:szCs w:val="20"/>
-        </w:rPr>
-      </w:pPr>
-    </w:p>
-    <w:p>
-      <w:pPr>
-        <w:spacing w:after="0" w:line="240" w:lineRule="auto"/>
-        <w:rPr>
-          <w:rFonts w:ascii="Arial" w:eastAsia="Arial" w:hAnsi="Arial" w:cs="Arial"/>
-          <w:b/>
           <w:color w:val="FF3333"/>
           <w:sz w:val="16"/>
           <w:szCs w:val="16"/>
@@ -1384,7 +1298,109 @@
           <w:sz w:val="20"/>
           <w:szCs w:val="20"/>
         </w:rPr>
-        <w:t>Local (cenário) previsto para a implementação do projeto</w:t>
+        <w:t>Público-alvo a ser atendido pelo projeto</w:t>
+      </w:r>
+    </w:p>
+    <w:tbl>
+      <w:tblPr>
+        <w:tblW w:w="9300" w:type="dxa"/>
+        <w:tblLayout w:type="fixed"/>
+        <w:tblLook w:val="0000" w:firstRow="0" w:lastRow="0" w:firstColumn="0" w:lastColumn="0" w:noHBand="0" w:noVBand="0"/>
+      </w:tblPr>
+      <w:tblGrid>
+        <w:gridCol w:w="9300"/>
+      </w:tblGrid>
+      <w:tr>
+        <w:tc>
+          <w:tcPr>
+            <w:tcW w:w="9300" w:type="dxa"/>
+            <w:tcBorders>
+              <w:top w:val="single" w:sz="4" w:space="0" w:color="000000"/>
+              <w:left w:val="single" w:sz="4" w:space="0" w:color="000000"/>
+              <w:bottom w:val="single" w:sz="4" w:space="0" w:color="000000"/>
+              <w:right w:val="single" w:sz="4" w:space="0" w:color="000000"/>
+            </w:tcBorders>
+          </w:tcPr>
+          <w:p>
+            <w:pPr>
+              <w:pBdr>
+                <w:top w:val="nil"/>
+                <w:left w:val="nil"/>
+                <w:bottom w:val="nil"/>
+                <w:right w:val="nil"/>
+                <w:between w:val="nil"/>
+              </w:pBdr>
+              <w:spacing w:after="0" w:line="240" w:lineRule="auto"/>
+              <w:rPr>
+                <w:sz w:val="20"/>
+                <w:szCs w:val="20"/>
+              </w:rPr>
+            </w:pPr>
+            <w:r>
+              <w:rPr>
+                <w:sz w:val="20"/>
+                <w:szCs w:val="20"/>
+              </w:rPr>
+              <w:lastRenderedPageBreak/>
+              <w:t>O público-alvo será composto por organizadores de eventos, fornecedores de serviços e administradores da plataforma TicketLab.</w:t>
+            </w:r>
+            <w:r>
+              <w:rPr>
+                <w:sz w:val="20"/>
+                <w:szCs w:val="20"/>
+              </w:rPr>
+              <w:br/>
+              <w:t>O sistema atenderá pessoas que buscam facilitar a organização e o gerenciamento de eventos.</w:t>
+            </w:r>
+            <w:r>
+              <w:rPr>
+                <w:sz w:val="20"/>
+                <w:szCs w:val="20"/>
+              </w:rPr>
+              <w:br/>
+              <w:t>Os usuários poderão ter diferentes níveis de experiência e conhecimento tecnológico.</w:t>
+            </w:r>
+            <w:r>
+              <w:rPr>
+                <w:sz w:val="20"/>
+                <w:szCs w:val="20"/>
+              </w:rPr>
+              <w:br/>
+              <w:t>A plataforma pretende oferecer uma navegação simples, acessível e adequada às necessidades de cada perfil.</w:t>
+            </w:r>
+          </w:p>
+        </w:tc>
+      </w:tr>
+    </w:tbl>
+    <w:p>
+      <w:pPr>
+        <w:spacing w:after="0" w:line="240" w:lineRule="auto"/>
+        <w:rPr>
+          <w:rFonts w:ascii="Arial" w:eastAsia="Arial" w:hAnsi="Arial" w:cs="Arial"/>
+          <w:b/>
+          <w:sz w:val="20"/>
+          <w:szCs w:val="20"/>
+        </w:rPr>
+      </w:pPr>
+    </w:p>
+    <w:p>
+      <w:pPr>
+        <w:spacing w:after="0" w:line="240" w:lineRule="auto"/>
+        <w:rPr>
+          <w:rFonts w:ascii="Arial" w:eastAsia="Arial" w:hAnsi="Arial" w:cs="Arial"/>
+          <w:b/>
+          <w:sz w:val="20"/>
+          <w:szCs w:val="20"/>
+        </w:rPr>
+      </w:pPr>
+      <w:r>
+        <w:rPr>
+          <w:rFonts w:ascii="Arial" w:eastAsia="Arial" w:hAnsi="Arial" w:cs="Arial"/>
+          <w:b/>
+          <w:sz w:val="20"/>
+          <w:szCs w:val="20"/>
+        </w:rPr>
+        <w:t>Apresentação do(s) problema(s) observado(s) e delimitação do objeto de estudo e intervenção</w:t>
       </w:r>
     </w:p>
     <w:tbl>
@@ -1420,7 +1436,7 @@
               <w:jc w:val="both"/>
               <w:rPr>
                 <w:rFonts w:ascii="Arial" w:eastAsia="Arial" w:hAnsi="Arial" w:cs="Arial"/>
-                <w:color w:val="FF3333"/>
+                <w:color w:val="1F4E79"/>
                 <w:sz w:val="20"/>
                 <w:szCs w:val="20"/>
               </w:rPr>
@@ -1428,11 +1444,10 @@
             <w:r>
               <w:rPr>
                 <w:rFonts w:ascii="Arial" w:eastAsia="Arial" w:hAnsi="Arial" w:cs="Arial"/>
-                <w:color w:val="0C3512" w:themeColor="accent3" w:themeShade="80"/>
-                <w:sz w:val="20"/>
-                <w:szCs w:val="20"/>
-              </w:rPr>
-              <w:t xml:space="preserve">Inserir os dados neste espaço. Orientações: conhecer na prática a realidade do campo de atuação. Definir e descrever o local em que a intervenção prevista na atividade de extensão pode ser implementada, lembrando que não há obrigatoriedade de esta ação ser efetivamente colocada em prática neste momento. É importante considerar intervenções tecnicamente exequíveis, sustentáveis e economicamente viáveis. </w:t>
+                <w:sz w:val="20"/>
+                <w:szCs w:val="20"/>
+              </w:rPr>
+              <w:t>Foi identificada a necessidade de facilitar a comunicação e a organização entre organizadores de eventos e fornecedores. A falta de uma plataforma centralizada pode dificultar o gerenciamento das informações e dos serviços. O projeto TicketLab busca solucionar esse problema por meio de um sistema web com funcionalidades específicas para cada perfil. A intervenção será delimitada ao desenvolvimento de um protótipo navegável que demonstre essas funcionalidades.</w:t>
             </w:r>
           </w:p>
         </w:tc>
@@ -1455,9 +1470,8 @@
         <w:rPr>
           <w:rFonts w:ascii="Arial" w:eastAsia="Arial" w:hAnsi="Arial" w:cs="Arial"/>
           <w:b/>
-          <w:color w:val="FF3333"/>
-          <w:sz w:val="16"/>
-          <w:szCs w:val="16"/>
+          <w:sz w:val="20"/>
+          <w:szCs w:val="20"/>
         </w:rPr>
       </w:pPr>
       <w:r>
@@ -1467,7 +1481,7 @@
           <w:sz w:val="20"/>
           <w:szCs w:val="20"/>
         </w:rPr>
-        <w:t>Público-alvo a ser atendido pelo projeto</w:t>
+        <w:t>Definição de hipóteses para a solução do problema observado</w:t>
       </w:r>
     </w:p>
     <w:tbl>
@@ -1503,7 +1517,7 @@
               <w:jc w:val="both"/>
               <w:rPr>
                 <w:rFonts w:ascii="Arial" w:eastAsia="Arial" w:hAnsi="Arial" w:cs="Arial"/>
-                <w:color w:val="1F4E79"/>
+                <w:color w:val="FF3333"/>
                 <w:sz w:val="20"/>
                 <w:szCs w:val="20"/>
               </w:rPr>
@@ -1511,11 +1525,10 @@
             <w:r>
               <w:rPr>
                 <w:rFonts w:ascii="Arial" w:eastAsia="Arial" w:hAnsi="Arial" w:cs="Arial"/>
-                <w:color w:val="0C3512" w:themeColor="accent3" w:themeShade="80"/>
-                <w:sz w:val="20"/>
-                <w:szCs w:val="20"/>
-              </w:rPr>
-              <w:t xml:space="preserve">Inserir os dados neste espaço. Orientações: buscar conhecer na prática a realidade do campo de atuação para a intervenção extensionista. Definir os sujeitos que poderão ser impactados pela intervenção. Caracterizar o público-alvo, características socioeconômicas e educacionais ou outros dados considerados relevantes. Nesta etapa poderá ser realizado um levantamento diagnóstico da comunidade, os dados podem ser obtidos na prática com base na metodologia proposta para o projeto de extensão (visitas, entrevistas, questionários, reuniões, roda de conversa, ou uso de outras ferramentas de levantamento). Adequar a proposta de acordo com as especificidades do curso. Os dados aqui inseridos também podem ser empregados na concepção do projeto propriamente dito. </w:t>
+                <w:sz w:val="20"/>
+                <w:szCs w:val="20"/>
+              </w:rPr>
+              <w:t>A criação da plataforma TicketLab pode facilitar a comunicação entre organizadores de eventos e fornecedores, centralizando informações e funcionalidades em um único sistema. A hipótese é que uma interface intuitiva, com cadastros e áreas específicas para cada perfil, torne o gerenciamento mais simples e eficiente. A solução escolhida é o desenvolvimento de um protótipo navegável, viável economicamente e que permita testar os principais fluxos antes da implementação completa.</w:t>
             </w:r>
           </w:p>
         </w:tc>
@@ -1542,6 +1555,16 @@
           <w:szCs w:val="20"/>
         </w:rPr>
       </w:pPr>
+    </w:p>
+    <w:p>
+      <w:pPr>
+        <w:spacing w:after="0" w:line="240" w:lineRule="auto"/>
+        <w:rPr>
+          <w:rFonts w:ascii="Arial" w:eastAsia="Arial" w:hAnsi="Arial" w:cs="Arial"/>
+          <w:sz w:val="20"/>
+          <w:szCs w:val="20"/>
+        </w:rPr>
+      </w:pPr>
       <w:r>
         <w:rPr>
           <w:rFonts w:ascii="Arial" w:eastAsia="Arial" w:hAnsi="Arial" w:cs="Arial"/>
@@ -1549,259 +1572,7 @@
           <w:sz w:val="20"/>
           <w:szCs w:val="20"/>
         </w:rPr>
-        <w:t>Apresentação do(s) problema(s) observado(s) e delimitação do objeto de estudo e intervenção</w:t>
-      </w:r>
-    </w:p>
-    <w:tbl>
-      <w:tblPr>
-        <w:tblW w:w="9300" w:type="dxa"/>
-        <w:tblLayout w:type="fixed"/>
-        <w:tblLook w:val="0000" w:firstRow="0" w:lastRow="0" w:firstColumn="0" w:lastColumn="0" w:noHBand="0" w:noVBand="0"/>
-      </w:tblPr>
-      <w:tblGrid>
-        <w:gridCol w:w="9300"/>
-      </w:tblGrid>
-      <w:tr>
-        <w:tc>
-          <w:tcPr>
-            <w:tcW w:w="9300" w:type="dxa"/>
-            <w:tcBorders>
-              <w:top w:val="single" w:sz="4" w:space="0" w:color="000000"/>
-              <w:left w:val="single" w:sz="4" w:space="0" w:color="000000"/>
-              <w:bottom w:val="single" w:sz="4" w:space="0" w:color="000000"/>
-              <w:right w:val="single" w:sz="4" w:space="0" w:color="000000"/>
-            </w:tcBorders>
-          </w:tcPr>
-          <w:p>
-            <w:pPr>
-              <w:pBdr>
-                <w:top w:val="nil"/>
-                <w:left w:val="nil"/>
-                <w:bottom w:val="nil"/>
-                <w:right w:val="nil"/>
-                <w:between w:val="nil"/>
-              </w:pBdr>
-              <w:spacing w:after="0" w:line="240" w:lineRule="auto"/>
-              <w:jc w:val="both"/>
-              <w:rPr>
-                <w:rFonts w:ascii="Arial" w:eastAsia="Arial" w:hAnsi="Arial" w:cs="Arial"/>
-                <w:color w:val="1F4E79"/>
-                <w:sz w:val="20"/>
-                <w:szCs w:val="20"/>
-              </w:rPr>
-            </w:pPr>
-            <w:r>
-              <w:rPr>
-                <w:rFonts w:ascii="Arial" w:eastAsia="Arial" w:hAnsi="Arial" w:cs="Arial"/>
-                <w:color w:val="0C3512" w:themeColor="accent3" w:themeShade="80"/>
-                <w:sz w:val="20"/>
-                <w:szCs w:val="20"/>
-              </w:rPr>
-              <w:t>Inserir os dados neste espaço. Orientações:</w:t>
-            </w:r>
-            <w:r>
-              <w:rPr>
-                <w:rFonts w:ascii="Arial" w:eastAsia="Arial" w:hAnsi="Arial" w:cs="Arial"/>
-                <w:b/>
-                <w:color w:val="0C3512" w:themeColor="accent3" w:themeShade="80"/>
-                <w:sz w:val="16"/>
-                <w:szCs w:val="16"/>
-              </w:rPr>
-              <w:t xml:space="preserve"> </w:t>
-            </w:r>
-            <w:r>
-              <w:rPr>
-                <w:rFonts w:ascii="Arial" w:eastAsia="Arial" w:hAnsi="Arial" w:cs="Arial"/>
-                <w:color w:val="0C3512" w:themeColor="accent3" w:themeShade="80"/>
-                <w:sz w:val="20"/>
-                <w:szCs w:val="20"/>
-              </w:rPr>
-              <w:t xml:space="preserve">observar a realidade em si, identificar os postos-chave, os problemas apontados e suas características para que o plano de intervenção possa contribuir na transformação da realidade observada. Selecionar o problema que será objeto da intervenção e apresentar argumentos relativos à sua relevância de estudo. Os dados aqui inseridos também podem ser empregados na concepção do projeto propriamente dito. </w:t>
-            </w:r>
-          </w:p>
-        </w:tc>
-      </w:tr>
-    </w:tbl>
-    <w:p>
-      <w:pPr>
-        <w:spacing w:after="0" w:line="240" w:lineRule="auto"/>
-        <w:rPr>
-          <w:rFonts w:ascii="Arial" w:eastAsia="Arial" w:hAnsi="Arial" w:cs="Arial"/>
-          <w:b/>
-          <w:sz w:val="20"/>
-          <w:szCs w:val="20"/>
-        </w:rPr>
-      </w:pPr>
-    </w:p>
-    <w:p>
-      <w:pPr>
-        <w:spacing w:after="0" w:line="240" w:lineRule="auto"/>
-        <w:rPr>
-          <w:rFonts w:ascii="Arial" w:eastAsia="Arial" w:hAnsi="Arial" w:cs="Arial"/>
-          <w:b/>
-          <w:sz w:val="20"/>
-          <w:szCs w:val="20"/>
-        </w:rPr>
-      </w:pPr>
-      <w:r>
-        <w:rPr>
-          <w:rFonts w:ascii="Arial" w:eastAsia="Arial" w:hAnsi="Arial" w:cs="Arial"/>
-          <w:b/>
-          <w:sz w:val="20"/>
-          <w:szCs w:val="20"/>
-        </w:rPr>
-        <w:t>Definição de hipóteses para a solução do problema observado</w:t>
-      </w:r>
-    </w:p>
-    <w:tbl>
-      <w:tblPr>
-        <w:tblW w:w="9300" w:type="dxa"/>
-        <w:tblLayout w:type="fixed"/>
-        <w:tblLook w:val="0000" w:firstRow="0" w:lastRow="0" w:firstColumn="0" w:lastColumn="0" w:noHBand="0" w:noVBand="0"/>
-      </w:tblPr>
-      <w:tblGrid>
-        <w:gridCol w:w="9300"/>
-      </w:tblGrid>
-      <w:tr>
-        <w:tc>
-          <w:tcPr>
-            <w:tcW w:w="9300" w:type="dxa"/>
-            <w:tcBorders>
-              <w:top w:val="single" w:sz="4" w:space="0" w:color="000000"/>
-              <w:left w:val="single" w:sz="4" w:space="0" w:color="000000"/>
-              <w:bottom w:val="single" w:sz="4" w:space="0" w:color="000000"/>
-              <w:right w:val="single" w:sz="4" w:space="0" w:color="000000"/>
-            </w:tcBorders>
-          </w:tcPr>
-          <w:p>
-            <w:pPr>
-              <w:pBdr>
-                <w:top w:val="nil"/>
-                <w:left w:val="nil"/>
-                <w:bottom w:val="nil"/>
-                <w:right w:val="nil"/>
-                <w:between w:val="nil"/>
-              </w:pBdr>
-              <w:spacing w:after="0" w:line="240" w:lineRule="auto"/>
-              <w:jc w:val="both"/>
-              <w:rPr>
-                <w:rFonts w:ascii="Arial" w:eastAsia="Arial" w:hAnsi="Arial" w:cs="Arial"/>
-                <w:color w:val="FF3333"/>
-                <w:sz w:val="20"/>
-                <w:szCs w:val="20"/>
-              </w:rPr>
-            </w:pPr>
-            <w:r>
-              <w:rPr>
-                <w:rFonts w:ascii="Arial" w:eastAsia="Arial" w:hAnsi="Arial" w:cs="Arial"/>
-                <w:color w:val="0C3512" w:themeColor="accent3" w:themeShade="80"/>
-                <w:sz w:val="20"/>
-                <w:szCs w:val="20"/>
-              </w:rPr>
-              <w:t>Inserir os dados neste espaço. Orientações:</w:t>
-            </w:r>
-            <w:r>
-              <w:rPr>
-                <w:rFonts w:ascii="Arial" w:eastAsia="Arial" w:hAnsi="Arial" w:cs="Arial"/>
-                <w:b/>
-                <w:color w:val="0C3512" w:themeColor="accent3" w:themeShade="80"/>
-                <w:sz w:val="16"/>
-                <w:szCs w:val="16"/>
-              </w:rPr>
-              <w:t xml:space="preserve"> </w:t>
-            </w:r>
-            <w:r>
-              <w:rPr>
-                <w:rFonts w:ascii="Arial" w:eastAsia="Arial" w:hAnsi="Arial" w:cs="Arial"/>
-                <w:color w:val="0C3512" w:themeColor="accent3" w:themeShade="80"/>
-                <w:sz w:val="20"/>
-                <w:szCs w:val="20"/>
-              </w:rPr>
-              <w:t>as hipóteses devem ser construídas após a teorização e estudo do problema observado. Relacionar hipóteses de intervenção para solução do problema de estudo e selecionar a mais adequada. É importante considerar intervenções tecnicamente exequíveis, sustentáveis e economicamente viáveis</w:t>
-            </w:r>
-            <w:r>
-              <w:rPr>
-                <w:rFonts w:ascii="Arial" w:eastAsia="Arial" w:hAnsi="Arial" w:cs="Arial"/>
-                <w:b/>
-                <w:color w:val="0C3512" w:themeColor="accent3" w:themeShade="80"/>
-                <w:sz w:val="16"/>
-                <w:szCs w:val="16"/>
-              </w:rPr>
-              <w:t>.</w:t>
-            </w:r>
-          </w:p>
-        </w:tc>
-      </w:tr>
-    </w:tbl>
-    <w:p>
-      <w:pPr>
-        <w:spacing w:after="0" w:line="240" w:lineRule="auto"/>
-        <w:rPr>
-          <w:rFonts w:ascii="Arial" w:eastAsia="Arial" w:hAnsi="Arial" w:cs="Arial"/>
-          <w:b/>
-          <w:sz w:val="20"/>
-          <w:szCs w:val="20"/>
-        </w:rPr>
-      </w:pPr>
-    </w:p>
-    <w:p>
-      <w:pPr>
-        <w:spacing w:after="0" w:line="240" w:lineRule="auto"/>
-        <w:rPr>
-          <w:rFonts w:ascii="Arial" w:eastAsia="Arial" w:hAnsi="Arial" w:cs="Arial"/>
-          <w:b/>
-          <w:sz w:val="20"/>
-          <w:szCs w:val="20"/>
-        </w:rPr>
-      </w:pPr>
-    </w:p>
-    <w:p>
-      <w:pPr>
-        <w:spacing w:after="0" w:line="240" w:lineRule="auto"/>
-        <w:rPr>
-          <w:rFonts w:ascii="Arial" w:eastAsia="Arial" w:hAnsi="Arial" w:cs="Arial"/>
-          <w:sz w:val="20"/>
-          <w:szCs w:val="20"/>
-        </w:rPr>
-      </w:pPr>
-      <w:r>
-        <w:rPr>
-          <w:rFonts w:ascii="Arial" w:eastAsia="Arial" w:hAnsi="Arial" w:cs="Arial"/>
-          <w:b/>
-          <w:sz w:val="20"/>
-          <w:szCs w:val="20"/>
-        </w:rPr>
         <w:t>3 DESCRIÇÃO DO PROJETO</w:t>
-      </w:r>
-    </w:p>
-    <w:p>
-      <w:pPr>
-        <w:pBdr>
-          <w:top w:val="nil"/>
-          <w:left w:val="nil"/>
-          <w:bottom w:val="nil"/>
-          <w:right w:val="nil"/>
-          <w:between w:val="nil"/>
-        </w:pBdr>
-        <w:spacing w:after="0" w:line="240" w:lineRule="auto"/>
-        <w:jc w:val="both"/>
-        <w:rPr>
-          <w:rFonts w:ascii="Arial" w:eastAsia="Arial" w:hAnsi="Arial" w:cs="Arial"/>
-          <w:b/>
-          <w:color w:val="0C3512" w:themeColor="accent3" w:themeShade="80"/>
-          <w:sz w:val="16"/>
-          <w:szCs w:val="16"/>
-        </w:rPr>
-      </w:pPr>
-      <w:r>
-        <w:rPr>
-          <w:rFonts w:ascii="Arial" w:eastAsia="Arial" w:hAnsi="Arial" w:cs="Arial"/>
-          <w:b/>
-          <w:color w:val="0C3512" w:themeColor="accent3" w:themeShade="80"/>
-          <w:sz w:val="16"/>
-          <w:szCs w:val="16"/>
-        </w:rPr>
-        <w:t xml:space="preserve">É importante destacar que um projeto de extensão não precisa ser necessariamente igual a um projeto de pesquisa. Mesmo que haja necessidade de pesquisa prévia para a fundamentação teórica, construção da introdução e para um melhor entendimento sobre a realidade a ser trabalhada, é preciso que um projeto de extensão contemple práticas que promovam mudanças e/ou melhorias identificadas como necessárias. O projeto final deverá ser simples, objetivo, claro e ter de 3 a 5 páginas, dentro do modelo aqui proposto. </w:t>
       </w:r>
     </w:p>
     <w:p>
@@ -1868,30 +1639,28 @@
             <w:r>
               <w:rPr>
                 <w:rFonts w:ascii="Arial" w:eastAsia="Arial" w:hAnsi="Arial" w:cs="Arial"/>
-                <w:color w:val="0C3512" w:themeColor="accent3" w:themeShade="80"/>
-                <w:sz w:val="20"/>
-                <w:szCs w:val="20"/>
-              </w:rPr>
-              <w:t>Inserir os dados neste espaço. Orientações:</w:t>
-            </w:r>
-            <w:r>
-              <w:rPr>
-                <w:rFonts w:ascii="Arial" w:eastAsia="Arial" w:hAnsi="Arial" w:cs="Arial"/>
-                <w:b/>
-                <w:color w:val="0C3512" w:themeColor="accent3" w:themeShade="80"/>
-                <w:sz w:val="16"/>
-                <w:szCs w:val="16"/>
-              </w:rPr>
-              <w:t xml:space="preserve"> </w:t>
-            </w:r>
-            <w:r>
-              <w:rPr>
-                <w:rFonts w:ascii="Arial" w:eastAsia="Arial" w:hAnsi="Arial" w:cs="Arial"/>
-                <w:color w:val="0C3512" w:themeColor="accent3" w:themeShade="80"/>
-                <w:sz w:val="20"/>
-                <w:szCs w:val="20"/>
-              </w:rPr>
-              <w:t xml:space="preserve">texto sem parágrafos. Trata-se de um resumo, apresentado de forma sintética, clara, objetiva e concisa, dos pontos mais importantes da proposta do projeto: breve descrição do estudo, o problema a ser focado, público-alvo ou comunidade que será envolvido na ação extensionista, o objetivo geral da ação extensionista, as metodologias a serem utilizadas, as atividades previstas, os resultados esperados, e outras informações que forem consideradas relevantes. Escrever um texto curto. </w:t>
+                <w:sz w:val="20"/>
+                <w:szCs w:val="20"/>
+              </w:rPr>
+              <w:t xml:space="preserve">O projeto TicketLab consiste no desenvolvimento de um protótipo navegável de uma plataforma web voltada à organização de eventos, conectando organizadores, fornecedores e administradores. A proposta busca facilitar o gerenciamento de informações e serviços por meio de uma interface intuitiva e funcionalidades específicas para cada perfil. O público-alvo inclui pessoas envolvidas na organização e prestação de serviços para eventos. A metodologia envolve o planejamento das telas, o desenvolvimento do protótipo no </w:t>
+            </w:r>
+            <w:proofErr w:type="spellStart"/>
+            <w:r>
+              <w:rPr>
+                <w:rFonts w:ascii="Arial" w:eastAsia="Arial" w:hAnsi="Arial" w:cs="Arial"/>
+                <w:sz w:val="20"/>
+                <w:szCs w:val="20"/>
+              </w:rPr>
+              <w:t>Bolt.new</w:t>
+            </w:r>
+            <w:proofErr w:type="spellEnd"/>
+            <w:r>
+              <w:rPr>
+                <w:rFonts w:ascii="Arial" w:eastAsia="Arial" w:hAnsi="Arial" w:cs="Arial"/>
+                <w:sz w:val="20"/>
+                <w:szCs w:val="20"/>
+              </w:rPr>
+              <w:t xml:space="preserve"> e a realização de testes de navegação. Espera-se demonstrar uma solução tecnológica viável, acessível e capaz de melhorar a organização dos processos relacionados a eventos.</w:t>
             </w:r>
           </w:p>
         </w:tc>
@@ -1962,48 +1731,28 @@
             <w:r>
               <w:rPr>
                 <w:rFonts w:ascii="Arial" w:eastAsia="Arial" w:hAnsi="Arial" w:cs="Arial"/>
-                <w:color w:val="0C3512" w:themeColor="accent3" w:themeShade="80"/>
-                <w:sz w:val="20"/>
-                <w:szCs w:val="20"/>
-              </w:rPr>
-              <w:t>Inserir os dados neste espaço. Orientações:</w:t>
+                <w:sz w:val="20"/>
+                <w:szCs w:val="20"/>
+              </w:rPr>
+              <w:t xml:space="preserve">O avanço das tecnologias digitais tem possibilitado o desenvolvimento de plataformas que facilitam a comunicação, a organização e o gerenciamento de atividades. Nesse contexto, o projeto TicketLab propõe um protótipo navegável de um sistema web destinado a organizadores de eventos, fornecedores de serviços e administradores, buscando centralizar funcionalidades e simplificar processos. Segundo a ISO (2018), a usabilidade de um sistema está relacionada à sua eficácia, eficiência e satisfação durante a utilização, aspectos considerados no planejamento das telas e dos fluxos de navegação. O projeto relaciona-se ao </w:t>
             </w:r>
             <w:r>
               <w:rPr>
                 <w:rFonts w:ascii="Arial" w:eastAsia="Arial" w:hAnsi="Arial" w:cs="Arial"/>
                 <w:b/>
-                <w:color w:val="0C3512" w:themeColor="accent3" w:themeShade="80"/>
-                <w:sz w:val="16"/>
-                <w:szCs w:val="16"/>
-              </w:rPr>
-              <w:t xml:space="preserve"> </w:t>
-            </w:r>
-            <w:r>
-              <w:rPr>
-                <w:rFonts w:ascii="Arial" w:eastAsia="Arial" w:hAnsi="Arial" w:cs="Arial"/>
-                <w:color w:val="0C3512" w:themeColor="accent3" w:themeShade="80"/>
-                <w:sz w:val="20"/>
-                <w:szCs w:val="20"/>
-              </w:rPr>
-              <w:t>apresentar a introdução com base na fundamentação teórica sobre o tema trabalhado e que situe o objeto da intervenção, afirmando sua relevância. Descrever as áreas e ODS impactados, incluir o referencial teórico, usar referências segundo ABNT. Não se trata de uma monografia e sim de uma atividade de extensão, por isso a introdução deve ser clara, objetiva</w:t>
-            </w:r>
-            <w:r>
-              <w:rPr>
-                <w:rFonts w:ascii="Arial" w:eastAsia="Arial" w:hAnsi="Arial" w:cs="Arial"/>
-                <w:color w:val="0C3512" w:themeColor="accent3" w:themeShade="80"/>
-                <w:sz w:val="20"/>
-                <w:szCs w:val="20"/>
-              </w:rPr>
-              <w:t xml:space="preserve"> </w:t>
-            </w:r>
-            <w:r>
-              <w:rPr>
-                <w:rFonts w:ascii="Arial" w:eastAsia="Arial" w:hAnsi="Arial" w:cs="Arial"/>
-                <w:color w:val="0C3512" w:themeColor="accent3" w:themeShade="80"/>
-                <w:sz w:val="20"/>
-                <w:szCs w:val="20"/>
-              </w:rPr>
-              <w:t xml:space="preserve">e sintética. </w:t>
+                <w:bCs/>
+                <w:sz w:val="20"/>
+                <w:szCs w:val="20"/>
+              </w:rPr>
+              <w:t>ODS 9 — Indústria, Inovação e Infraestrutura</w:t>
+            </w:r>
+            <w:r>
+              <w:rPr>
+                <w:rFonts w:ascii="Arial" w:eastAsia="Arial" w:hAnsi="Arial" w:cs="Arial"/>
+                <w:sz w:val="20"/>
+                <w:szCs w:val="20"/>
+              </w:rPr>
+              <w:t>, da Organização das Nações Unidas, por incentivar o desenvolvimento e a aplicação de soluções tecnológicas inovadoras (ONU, s.d.). Espera-se demonstrar a viabilidade da proposta e contribuir para uma experiência de utilização mais simples e organizada.</w:t>
             </w:r>
           </w:p>
         </w:tc>
@@ -2069,7 +1818,6 @@
               <w:jc w:val="both"/>
               <w:rPr>
                 <w:rFonts w:ascii="Arial" w:eastAsia="Arial" w:hAnsi="Arial" w:cs="Arial"/>
-                <w:color w:val="FF3333"/>
                 <w:sz w:val="20"/>
                 <w:szCs w:val="20"/>
               </w:rPr>
@@ -2077,30 +1825,207 @@
             <w:r>
               <w:rPr>
                 <w:rFonts w:ascii="Arial" w:eastAsia="Arial" w:hAnsi="Arial" w:cs="Arial"/>
-                <w:color w:val="0C3512" w:themeColor="accent3" w:themeShade="80"/>
-                <w:sz w:val="20"/>
-                <w:szCs w:val="20"/>
-              </w:rPr>
-              <w:t>Inserir os dados neste espaço. Orientações:</w:t>
-            </w:r>
-            <w:r>
-              <w:rPr>
-                <w:rFonts w:ascii="Arial" w:eastAsia="Arial" w:hAnsi="Arial" w:cs="Arial"/>
+                <w:sz w:val="20"/>
+                <w:szCs w:val="20"/>
+              </w:rPr>
+              <w:t>I</w:t>
+            </w:r>
+            <w:r>
+              <w:rPr>
+                <w:rFonts w:ascii="Times New Roman" w:eastAsia="Times New Roman" w:hAnsi="Times New Roman" w:cs="Times New Roman"/>
                 <w:b/>
-                <w:color w:val="0C3512" w:themeColor="accent3" w:themeShade="80"/>
-                <w:sz w:val="16"/>
-                <w:szCs w:val="16"/>
+                <w:bCs/>
+                <w:sz w:val="24"/>
+                <w:szCs w:val="24"/>
+                <w:lang w:eastAsia="ja-JP"/>
               </w:rPr>
               <w:t xml:space="preserve"> </w:t>
             </w:r>
             <w:r>
               <w:rPr>
                 <w:rFonts w:ascii="Arial" w:eastAsia="Arial" w:hAnsi="Arial" w:cs="Arial"/>
-                <w:color w:val="0C3512" w:themeColor="accent3" w:themeShade="80"/>
-                <w:sz w:val="20"/>
-                <w:szCs w:val="20"/>
-              </w:rPr>
-              <w:t>Descrever os objetivos de forma clara. Cada objetivo deve ter uma correspondência com os resultados esperados. Devem ser expressos sucintamente, em itens, iniciando a frase com verbo de ação e não em forma de relatos.</w:t>
+                <w:b/>
+                <w:bCs/>
+                <w:sz w:val="20"/>
+                <w:szCs w:val="20"/>
+              </w:rPr>
+              <w:t>Objetivo geral</w:t>
+            </w:r>
+          </w:p>
+          <w:p>
+            <w:pPr>
+              <w:tabs>
+                <w:tab w:val="left" w:pos="360"/>
+              </w:tabs>
+              <w:spacing w:after="0" w:line="240" w:lineRule="auto"/>
+              <w:jc w:val="both"/>
+              <w:rPr>
+                <w:rFonts w:ascii="Arial" w:eastAsia="Arial" w:hAnsi="Arial" w:cs="Arial"/>
+                <w:sz w:val="20"/>
+                <w:szCs w:val="20"/>
+              </w:rPr>
+            </w:pPr>
+            <w:r>
+              <w:rPr>
+                <w:rFonts w:ascii="Arial" w:eastAsia="Arial" w:hAnsi="Arial" w:cs="Arial"/>
+                <w:sz w:val="20"/>
+                <w:szCs w:val="20"/>
+              </w:rPr>
+              <w:t>Desenvolver um protótipo navegável da plataforma TicketLab para facilitar a organização e a gestão de informações entre organizadores de eventos, fornecedores e administradores.</w:t>
+            </w:r>
+          </w:p>
+          <w:p>
+            <w:pPr>
+              <w:tabs>
+                <w:tab w:val="left" w:pos="360"/>
+              </w:tabs>
+              <w:spacing w:after="0" w:line="240" w:lineRule="auto"/>
+              <w:jc w:val="both"/>
+              <w:rPr>
+                <w:rFonts w:ascii="Arial" w:eastAsia="Arial" w:hAnsi="Arial" w:cs="Arial"/>
+                <w:sz w:val="20"/>
+                <w:szCs w:val="20"/>
+              </w:rPr>
+            </w:pPr>
+            <w:r>
+              <w:rPr>
+                <w:rFonts w:ascii="Arial" w:eastAsia="Arial" w:hAnsi="Arial" w:cs="Arial"/>
+                <w:b/>
+                <w:bCs/>
+                <w:sz w:val="20"/>
+                <w:szCs w:val="20"/>
+              </w:rPr>
+              <w:t>Objetivos específicos</w:t>
+            </w:r>
+          </w:p>
+          <w:p>
+            <w:pPr>
+              <w:numPr>
+                <w:ilvl w:val="0"/>
+                <w:numId w:val="4"/>
+              </w:numPr>
+              <w:tabs>
+                <w:tab w:val="left" w:pos="360"/>
+              </w:tabs>
+              <w:spacing w:after="0" w:line="240" w:lineRule="auto"/>
+              <w:jc w:val="both"/>
+              <w:rPr>
+                <w:rFonts w:ascii="Arial" w:eastAsia="Arial" w:hAnsi="Arial" w:cs="Arial"/>
+                <w:sz w:val="20"/>
+                <w:szCs w:val="20"/>
+              </w:rPr>
+            </w:pPr>
+            <w:r>
+              <w:rPr>
+                <w:rFonts w:ascii="Arial" w:eastAsia="Arial" w:hAnsi="Arial" w:cs="Arial"/>
+                <w:sz w:val="20"/>
+                <w:szCs w:val="20"/>
+              </w:rPr>
+              <w:t>Desenvolver telas de login e cadastro para os usuários.</w:t>
+            </w:r>
+          </w:p>
+          <w:p>
+            <w:pPr>
+              <w:numPr>
+                <w:ilvl w:val="0"/>
+                <w:numId w:val="4"/>
+              </w:numPr>
+              <w:tabs>
+                <w:tab w:val="left" w:pos="360"/>
+              </w:tabs>
+              <w:spacing w:after="0" w:line="240" w:lineRule="auto"/>
+              <w:jc w:val="both"/>
+              <w:rPr>
+                <w:rFonts w:ascii="Arial" w:eastAsia="Arial" w:hAnsi="Arial" w:cs="Arial"/>
+                <w:sz w:val="20"/>
+                <w:szCs w:val="20"/>
+              </w:rPr>
+            </w:pPr>
+            <w:r>
+              <w:rPr>
+                <w:rFonts w:ascii="Arial" w:eastAsia="Arial" w:hAnsi="Arial" w:cs="Arial"/>
+                <w:sz w:val="20"/>
+                <w:szCs w:val="20"/>
+              </w:rPr>
+              <w:t>Representar as funcionalidades específicas de cada perfil.</w:t>
+            </w:r>
+          </w:p>
+          <w:p>
+            <w:pPr>
+              <w:numPr>
+                <w:ilvl w:val="0"/>
+                <w:numId w:val="4"/>
+              </w:numPr>
+              <w:tabs>
+                <w:tab w:val="left" w:pos="360"/>
+              </w:tabs>
+              <w:spacing w:after="0" w:line="240" w:lineRule="auto"/>
+              <w:jc w:val="both"/>
+              <w:rPr>
+                <w:rFonts w:ascii="Arial" w:eastAsia="Arial" w:hAnsi="Arial" w:cs="Arial"/>
+                <w:sz w:val="20"/>
+                <w:szCs w:val="20"/>
+              </w:rPr>
+            </w:pPr>
+            <w:r>
+              <w:rPr>
+                <w:rFonts w:ascii="Arial" w:eastAsia="Arial" w:hAnsi="Arial" w:cs="Arial"/>
+                <w:sz w:val="20"/>
+                <w:szCs w:val="20"/>
+              </w:rPr>
+              <w:t>Criar uma navegação intuitiva entre as páginas do sistema.</w:t>
+            </w:r>
+          </w:p>
+          <w:p>
+            <w:pPr>
+              <w:numPr>
+                <w:ilvl w:val="0"/>
+                <w:numId w:val="4"/>
+              </w:numPr>
+              <w:tabs>
+                <w:tab w:val="left" w:pos="360"/>
+              </w:tabs>
+              <w:spacing w:after="0" w:line="240" w:lineRule="auto"/>
+              <w:jc w:val="both"/>
+              <w:rPr>
+                <w:rFonts w:ascii="Arial" w:eastAsia="Arial" w:hAnsi="Arial" w:cs="Arial"/>
+                <w:sz w:val="20"/>
+                <w:szCs w:val="20"/>
+              </w:rPr>
+            </w:pPr>
+            <w:r>
+              <w:rPr>
+                <w:rFonts w:ascii="Arial" w:eastAsia="Arial" w:hAnsi="Arial" w:cs="Arial"/>
+                <w:sz w:val="20"/>
+                <w:szCs w:val="20"/>
+              </w:rPr>
+              <w:t>Demonstrar os principais fluxos de utilização por meio do protótipo.</w:t>
+            </w:r>
+          </w:p>
+          <w:p>
+            <w:pPr>
+              <w:numPr>
+                <w:ilvl w:val="0"/>
+                <w:numId w:val="4"/>
+              </w:numPr>
+              <w:tabs>
+                <w:tab w:val="left" w:pos="360"/>
+              </w:tabs>
+              <w:spacing w:after="0" w:line="240" w:lineRule="auto"/>
+              <w:jc w:val="both"/>
+              <w:rPr>
+                <w:rFonts w:ascii="Arial" w:eastAsia="Arial" w:hAnsi="Arial" w:cs="Arial"/>
+                <w:sz w:val="20"/>
+                <w:szCs w:val="20"/>
+              </w:rPr>
+            </w:pPr>
+            <w:r>
+              <w:rPr>
+                <w:rFonts w:ascii="Arial" w:eastAsia="Arial" w:hAnsi="Arial" w:cs="Arial"/>
+                <w:sz w:val="20"/>
+                <w:szCs w:val="20"/>
+              </w:rPr>
+              <w:t>Verificar a navegação e identificar possíveis melhorias na interface.</w:t>
             </w:r>
           </w:p>
         </w:tc>
@@ -2132,7 +2057,6 @@
           <w:sz w:val="20"/>
           <w:szCs w:val="20"/>
         </w:rPr>
-        <w:lastRenderedPageBreak/>
         <w:t xml:space="preserve">Métodos </w:t>
       </w:r>
     </w:p>
@@ -2169,30 +2093,29 @@
             <w:r>
               <w:rPr>
                 <w:rFonts w:ascii="Arial" w:eastAsia="Arial" w:hAnsi="Arial" w:cs="Arial"/>
-                <w:color w:val="0C3512" w:themeColor="accent3" w:themeShade="80"/>
-                <w:sz w:val="20"/>
-                <w:szCs w:val="20"/>
-              </w:rPr>
-              <w:t>Inserir os dados neste espaço. Orientações:</w:t>
-            </w:r>
-            <w:r>
-              <w:rPr>
-                <w:rFonts w:ascii="Arial" w:eastAsia="Arial" w:hAnsi="Arial" w:cs="Arial"/>
-                <w:b/>
-                <w:color w:val="0C3512" w:themeColor="accent3" w:themeShade="80"/>
-                <w:sz w:val="16"/>
-                <w:szCs w:val="16"/>
-              </w:rPr>
-              <w:t xml:space="preserve"> </w:t>
-            </w:r>
-            <w:r>
-              <w:rPr>
-                <w:rFonts w:ascii="Arial" w:eastAsia="Arial" w:hAnsi="Arial" w:cs="Arial"/>
-                <w:color w:val="0C3512" w:themeColor="accent3" w:themeShade="80"/>
-                <w:sz w:val="20"/>
-                <w:szCs w:val="20"/>
-              </w:rPr>
-              <w:t xml:space="preserve">descrever como ocorrerá a ação extensionista junto ao público-alvo. Trata-se descrição sobre como será realizada a prática da ação extensionista, é o detalhamento do caminho a ser percorrido pela equipe em sua interação com a sociedade. Descrever os métodos, técnicas e estratégias para a implementação das atividades de intervenção previstas no projeto e sua contribuição para o alcance dos objetivos. Descrever o local, público-alvo, ferramentas empregadas para a relação dialógica com a comunidade ou setores da sociedade: visitas, entrevistas, questionários, reuniões, roda de conversa, ou uso de outras ferramentas de levantamento. Detalhar os procedimentos e as atividades a serem implementadas. </w:t>
+                <w:sz w:val="20"/>
+                <w:szCs w:val="20"/>
+              </w:rPr>
+              <w:lastRenderedPageBreak/>
+              <w:t xml:space="preserve">O projeto será desenvolvido em ambiente computacional, utilizando a ferramenta </w:t>
+            </w:r>
+            <w:proofErr w:type="spellStart"/>
+            <w:r>
+              <w:rPr>
+                <w:rFonts w:ascii="Arial" w:eastAsia="Arial" w:hAnsi="Arial" w:cs="Arial"/>
+                <w:sz w:val="20"/>
+                <w:szCs w:val="20"/>
+              </w:rPr>
+              <w:t>Bolt.new</w:t>
+            </w:r>
+            <w:proofErr w:type="spellEnd"/>
+            <w:r>
+              <w:rPr>
+                <w:rFonts w:ascii="Arial" w:eastAsia="Arial" w:hAnsi="Arial" w:cs="Arial"/>
+                <w:sz w:val="20"/>
+                <w:szCs w:val="20"/>
+              </w:rPr>
+              <w:t xml:space="preserve"> para a criação do protótipo web TicketLab. Inicialmente, serão definidos os requisitos e os principais fluxos de navegação, considerando as necessidades de organizadores de eventos, fornecedores e administradores. Em seguida, serão elaboradas as telas da página inicial, login, escolha do tipo de cadastro, cadastro de organizadores e fornecedores, áreas específicas de cada perfil e página de erro 404. Após o desenvolvimento, serão realizados testes de navegação para verificar o funcionamento dos links, a organização das telas e a facilidade de utilização. Como forma de avaliação, poderão ser coletadas opiniões de usuários por meio de questionários ou conversas, permitindo identificar dificuldades e oportunidades de melhoria. Os resultados servirão de base para aperfeiçoar o protótipo e avaliar sua adequação à proposta do projeto.</w:t>
             </w:r>
           </w:p>
         </w:tc>
@@ -2261,31 +2184,10 @@
             <w:r>
               <w:rPr>
                 <w:rFonts w:ascii="Arial" w:eastAsia="Arial" w:hAnsi="Arial" w:cs="Arial"/>
-                <w:color w:val="0C3512" w:themeColor="accent3" w:themeShade="80"/>
-                <w:sz w:val="20"/>
-                <w:szCs w:val="20"/>
-              </w:rPr>
-              <w:t xml:space="preserve">Inserir os dados neste espaço. Orientações: este item pode ser apresentado como resultados parciais, ou </w:t>
-            </w:r>
-            <w:proofErr w:type="gramStart"/>
-            <w:r>
-              <w:rPr>
-                <w:rFonts w:ascii="Arial" w:eastAsia="Arial" w:hAnsi="Arial" w:cs="Arial"/>
-                <w:color w:val="0C3512" w:themeColor="accent3" w:themeShade="80"/>
-                <w:sz w:val="20"/>
-                <w:szCs w:val="20"/>
-              </w:rPr>
-              <w:t>resultados finais</w:t>
-            </w:r>
-            <w:proofErr w:type="gramEnd"/>
-            <w:r>
-              <w:rPr>
-                <w:rFonts w:ascii="Arial" w:eastAsia="Arial" w:hAnsi="Arial" w:cs="Arial"/>
-                <w:color w:val="0C3512" w:themeColor="accent3" w:themeShade="80"/>
-                <w:sz w:val="20"/>
-                <w:szCs w:val="20"/>
-              </w:rPr>
-              <w:t xml:space="preserve"> para projetos implementados, ou, ainda, resultados esperados para propostas de projetos. Descrever de forma objetiva de que modo o projeto espera modificar as condições inicialmente diagnosticadas no público-alvo envolvido. Trata-se de uma projeção dos impactos sociais esperados ou desejados, considerando que a extensão universitária busca estar atenta aos interesses e necessidades da maioria da população, buscando superar desigualdades, garantir diversidade, evitar exclusões, implementar o desenvolvimento regional e desenvolver políticas públicas. </w:t>
+                <w:sz w:val="20"/>
+                <w:szCs w:val="20"/>
+              </w:rPr>
+              <w:t>Espera-se que o protótipo TicketLab demonstre uma forma mais organizada de conectar organizadores de eventos, fornecedores e administradores em uma única plataforma. A navegação intuitiva e a separação das funcionalidades por perfil poderão facilitar o acesso às informações e reduzir dificuldades de utilização. Além disso, o projeto poderá contribuir para a inclusão digital ao considerar uma interface simples e acessível. Espera-se também que os testes permitam identificar melhorias antes de uma futura implementação completa do sistema.</w:t>
             </w:r>
           </w:p>
         </w:tc>
@@ -2350,7 +2252,6 @@
               <w:jc w:val="both"/>
               <w:rPr>
                 <w:rFonts w:ascii="Arial" w:eastAsia="Arial" w:hAnsi="Arial" w:cs="Arial"/>
-                <w:color w:val="FF3333"/>
                 <w:sz w:val="20"/>
                 <w:szCs w:val="20"/>
               </w:rPr>
@@ -2358,30 +2259,10 @@
             <w:r>
               <w:rPr>
                 <w:rFonts w:ascii="Arial" w:eastAsia="Arial" w:hAnsi="Arial" w:cs="Arial"/>
-                <w:color w:val="0C3512" w:themeColor="accent3" w:themeShade="80"/>
-                <w:sz w:val="20"/>
-                <w:szCs w:val="20"/>
-              </w:rPr>
-              <w:t>Inserir os dados neste espaço. Orientações:</w:t>
-            </w:r>
-            <w:r>
-              <w:rPr>
-                <w:rFonts w:ascii="Arial" w:eastAsia="Arial" w:hAnsi="Arial" w:cs="Arial"/>
-                <w:b/>
-                <w:color w:val="0C3512" w:themeColor="accent3" w:themeShade="80"/>
-                <w:sz w:val="16"/>
-                <w:szCs w:val="16"/>
-              </w:rPr>
-              <w:t xml:space="preserve"> </w:t>
-            </w:r>
-            <w:r>
-              <w:rPr>
-                <w:rFonts w:ascii="Arial" w:eastAsia="Arial" w:hAnsi="Arial" w:cs="Arial"/>
-                <w:color w:val="0C3512" w:themeColor="accent3" w:themeShade="80"/>
-                <w:sz w:val="20"/>
-                <w:szCs w:val="20"/>
-              </w:rPr>
-              <w:t>é o desfecho do projeto devendo responder o problema central do trabalho e destacar se o trabalho atendeu aos objetivos propostos, destacando os principais pontos e direções para futuras ações.</w:t>
+                <w:sz w:val="20"/>
+                <w:szCs w:val="20"/>
+              </w:rPr>
+              <w:t>O projeto TicketLab propõe uma solução tecnológica para facilitar a organização e o gerenciamento de informações relacionadas a eventos. Por meio do desenvolvimento de um protótipo navegável, busca-se demonstrar a viabilidade de reunir diferentes perfis de usuários em uma plataforma com funcionalidades específicas e navegação intuitiva. A proposta atende aos objetivos de representar os principais fluxos do sistema e avaliar sua utilização, contribuindo para identificar possíveis melhorias. Como perspectiva futura, o projeto poderá evoluir para uma aplicação completa, com banco de dados, autenticação de usuários e funcionalidades operacionais.</w:t>
             </w:r>
           </w:p>
         </w:tc>
@@ -2442,7 +2323,6 @@
               <w:spacing w:after="0" w:line="240" w:lineRule="auto"/>
               <w:rPr>
                 <w:rFonts w:ascii="Arial" w:eastAsia="Arial" w:hAnsi="Arial" w:cs="Arial"/>
-                <w:color w:val="1F4E79"/>
                 <w:sz w:val="20"/>
                 <w:szCs w:val="20"/>
               </w:rPr>
@@ -2450,11 +2330,116 @@
             <w:r>
               <w:rPr>
                 <w:rFonts w:ascii="Arial" w:eastAsia="Arial" w:hAnsi="Arial" w:cs="Arial"/>
+                <w:sz w:val="20"/>
+                <w:szCs w:val="20"/>
+                <w:lang w:val="en-US"/>
+              </w:rPr>
+              <w:t xml:space="preserve">INTERNATIONAL ORGANIZATION FOR STANDARDIZATION (ISO). </w:t>
+            </w:r>
+            <w:r>
+              <w:rPr>
+                <w:rFonts w:ascii="Arial" w:eastAsia="Arial" w:hAnsi="Arial" w:cs="Arial"/>
+                <w:i/>
+                <w:iCs/>
+                <w:sz w:val="20"/>
+                <w:szCs w:val="20"/>
+                <w:lang w:val="en-US"/>
+              </w:rPr>
+              <w:t>ISO 9241-11:2018: Ergonomics of human-system interaction — Part 11: Usability: Definitions and concepts</w:t>
+            </w:r>
+            <w:r>
+              <w:rPr>
+                <w:rFonts w:ascii="Arial" w:eastAsia="Arial" w:hAnsi="Arial" w:cs="Arial"/>
+                <w:sz w:val="20"/>
+                <w:szCs w:val="20"/>
+                <w:lang w:val="en-US"/>
+              </w:rPr>
+              <w:t xml:space="preserve">. </w:t>
+            </w:r>
+            <w:r>
+              <w:rPr>
+                <w:rFonts w:ascii="Arial" w:eastAsia="Arial" w:hAnsi="Arial" w:cs="Arial"/>
+                <w:sz w:val="20"/>
+                <w:szCs w:val="20"/>
+              </w:rPr>
+              <w:t xml:space="preserve">Geneva: ISO, 2018. Disponível em: </w:t>
+            </w:r>
+            <w:hyperlink r:id="rId10" w:history="1">
+              <w:r>
+                <w:rPr>
+                  <w:rStyle w:val="Hyperlink"/>
+                  <w:rFonts w:ascii="Arial" w:eastAsia="Arial" w:hAnsi="Arial" w:cs="Arial"/>
+                  <w:color w:val="auto"/>
+                  <w:sz w:val="20"/>
+                  <w:szCs w:val="20"/>
+                </w:rPr>
+                <w:t>https://www.iso.org/standard/63500.html</w:t>
+              </w:r>
+            </w:hyperlink>
+            <w:r>
+              <w:rPr>
+                <w:rFonts w:ascii="Arial" w:eastAsia="Arial" w:hAnsi="Arial" w:cs="Arial"/>
+                <w:sz w:val="20"/>
+                <w:szCs w:val="20"/>
+              </w:rPr>
+              <w:t>. Acesso em: 27 out. 2026.</w:t>
+            </w:r>
+          </w:p>
+          <w:p>
+            <w:pPr>
+              <w:spacing w:after="0" w:line="240" w:lineRule="auto"/>
+              <w:rPr>
+                <w:rFonts w:ascii="Arial" w:eastAsia="Arial" w:hAnsi="Arial" w:cs="Arial"/>
                 <w:color w:val="0C3512" w:themeColor="accent3" w:themeShade="80"/>
                 <w:sz w:val="20"/>
                 <w:szCs w:val="20"/>
               </w:rPr>
-              <w:t>Inserir os dados neste espaço. Orientações: Adotar a versão atual da ABNT.</w:t>
+            </w:pPr>
+            <w:r>
+              <w:rPr>
+                <w:rFonts w:ascii="Arial" w:eastAsia="Arial" w:hAnsi="Arial" w:cs="Arial"/>
+                <w:sz w:val="20"/>
+                <w:szCs w:val="20"/>
+              </w:rPr>
+              <w:t xml:space="preserve">ORGANIZAÇÃO DAS NAÇÕES UNIDAS (ONU). </w:t>
+            </w:r>
+            <w:r>
+              <w:rPr>
+                <w:rFonts w:ascii="Arial" w:eastAsia="Arial" w:hAnsi="Arial" w:cs="Arial"/>
+                <w:i/>
+                <w:iCs/>
+                <w:sz w:val="20"/>
+                <w:szCs w:val="20"/>
+              </w:rPr>
+              <w:t>Objetivo de Desenvolvimento Sustentável 9: Indústria, inovação e infraestrutura</w:t>
+            </w:r>
+            <w:r>
+              <w:rPr>
+                <w:rFonts w:ascii="Arial" w:eastAsia="Arial" w:hAnsi="Arial" w:cs="Arial"/>
+                <w:sz w:val="20"/>
+                <w:szCs w:val="20"/>
+              </w:rPr>
+              <w:t xml:space="preserve">. Disponível em: </w:t>
+            </w:r>
+            <w:hyperlink r:id="rId11" w:history="1">
+              <w:r>
+                <w:rPr>
+                  <w:rStyle w:val="Hyperlink"/>
+                  <w:rFonts w:ascii="Arial" w:eastAsia="Arial" w:hAnsi="Arial" w:cs="Arial"/>
+                  <w:color w:val="auto"/>
+                  <w:sz w:val="20"/>
+                  <w:szCs w:val="20"/>
+                </w:rPr>
+                <w:t>https://brasil.un.org/pt-br/sdgs/9</w:t>
+              </w:r>
+            </w:hyperlink>
+            <w:r>
+              <w:rPr>
+                <w:rFonts w:ascii="Arial" w:eastAsia="Arial" w:hAnsi="Arial" w:cs="Arial"/>
+                <w:sz w:val="20"/>
+                <w:szCs w:val="20"/>
+              </w:rPr>
+              <w:t>. Acesso em: 27 out. 2026.</w:t>
             </w:r>
           </w:p>
         </w:tc>
@@ -2587,7 +2572,38 @@
               <w:jc w:val="both"/>
               <w:rPr>
                 <w:rFonts w:ascii="Arial" w:eastAsia="Arial" w:hAnsi="Arial" w:cs="Arial"/>
+                <w:sz w:val="20"/>
+                <w:szCs w:val="20"/>
+                <w:highlight w:val="white"/>
+              </w:rPr>
+            </w:pPr>
+            <w:r>
+              <w:rPr>
+                <w:rFonts w:ascii="Arial" w:eastAsia="Arial" w:hAnsi="Arial" w:cs="Arial"/>
                 <w:b/>
+                <w:bCs/>
+                <w:sz w:val="20"/>
+                <w:szCs w:val="20"/>
+                <w:highlight w:val="white"/>
+              </w:rPr>
+              <w:t>Produto:</w:t>
+            </w:r>
+            <w:r>
+              <w:rPr>
+                <w:rFonts w:ascii="Arial" w:eastAsia="Arial" w:hAnsi="Arial" w:cs="Arial"/>
+                <w:sz w:val="20"/>
+                <w:szCs w:val="20"/>
+                <w:highlight w:val="white"/>
+              </w:rPr>
+              <w:t xml:space="preserve"> Protótipo navegável da plataforma TicketLab</w:t>
+            </w:r>
+          </w:p>
+          <w:p>
+            <w:pPr>
+              <w:jc w:val="both"/>
+              <w:rPr>
+                <w:rFonts w:ascii="Arial" w:eastAsia="Arial" w:hAnsi="Arial" w:cs="Arial"/>
+                <w:b/>
                 <w:sz w:val="20"/>
                 <w:szCs w:val="20"/>
               </w:rPr>
@@ -2595,12 +2611,29 @@
             <w:r>
               <w:rPr>
                 <w:rFonts w:ascii="Arial" w:eastAsia="Arial" w:hAnsi="Arial" w:cs="Arial"/>
-                <w:color w:val="0C3512" w:themeColor="accent3" w:themeShade="80"/>
-                <w:sz w:val="20"/>
-                <w:szCs w:val="20"/>
-                <w:highlight w:val="white"/>
-              </w:rPr>
-              <w:t>As atividades de extensão podem resultar em produto caracterizado a partir do fazer extensionista, sempre mediados pela interação dialógica entre a comunidade acadêmica e a sociedade e seus setores, sendo exemplos: softwares; aplicativos; protótipos; desenhos técnicos; patentes; simuladores; objetos de aprendizagem; games; insumos alternativos; processos e procedimentos operativos inovadores; relatórios; relatos de experiências; cartilhas; revistas; manuais; jornais; informativos; livros; anais; cartazes; artigos; resumos; pôster; banner; site; portal; hotsite; fotografia; vídeos; áudios; tutoriais, dentre outros.</w:t>
+                <w:b/>
+                <w:sz w:val="20"/>
+                <w:szCs w:val="20"/>
+              </w:rPr>
+              <w:t>Repositório do projeto:</w:t>
+            </w:r>
+            <w:r>
+              <w:rPr>
+                <w:rFonts w:ascii="Arial" w:eastAsia="Arial" w:hAnsi="Arial" w:cs="Arial"/>
+                <w:b/>
+                <w:sz w:val="20"/>
+                <w:szCs w:val="20"/>
+              </w:rPr>
+              <w:t xml:space="preserve"> </w:t>
+            </w:r>
+            <w:r>
+              <w:rPr>
+                <w:rFonts w:ascii="Arial" w:eastAsia="Arial" w:hAnsi="Arial" w:cs="Arial"/>
+                <w:b/>
+                <w:sz w:val="20"/>
+                <w:szCs w:val="20"/>
+              </w:rPr>
+              <w:t>https://github.com/2026-2-MCC2/Projeto8</w:t>
             </w:r>
           </w:p>
         </w:tc>
@@ -2806,16 +2839,6 @@
         </w:tc>
       </w:tr>
     </w:tbl>
-    <w:p>
-      <w:pPr>
-        <w:spacing w:after="0" w:line="240" w:lineRule="auto"/>
-        <w:rPr>
-          <w:rFonts w:ascii="Arial" w:eastAsia="Arial" w:hAnsi="Arial" w:cs="Arial"/>
-          <w:sz w:val="20"/>
-          <w:szCs w:val="20"/>
-        </w:rPr>
-      </w:pPr>
-    </w:p>
     <w:p/>
     <w:p>
       <w:pPr>
@@ -2832,6 +2855,7 @@
           <w:sz w:val="20"/>
           <w:szCs w:val="20"/>
         </w:rPr>
+        <w:lastRenderedPageBreak/>
         <w:t xml:space="preserve">Versão </w:t>
       </w:r>
       <w:r>
@@ -2877,8 +2901,8 @@
     </w:p>
     <w:p/>
     <w:sectPr>
-      <w:headerReference w:type="default" r:id="rId10"/>
-      <w:footerReference w:type="default" r:id="rId11"/>
+      <w:headerReference w:type="default" r:id="rId12"/>
+      <w:footerReference w:type="default" r:id="rId13"/>
       <w:pgSz w:w="11906" w:h="16838"/>
       <w:pgMar w:top="1417" w:right="1701" w:bottom="1417" w:left="1701" w:header="708" w:footer="708" w:gutter="0"/>
       <w:cols w:space="708"/>
@@ -3009,7 +3033,7 @@
         <w:noProof/>
       </w:rPr>
       <w:drawing>
-        <wp:anchor distT="0" distB="0" distL="114300" distR="114300" simplePos="0" relativeHeight="251658240" behindDoc="1" locked="0" layoutInCell="1" allowOverlap="1" wp14:anchorId="53A680AA" wp14:editId="03D89647">
+        <wp:anchor distT="0" distB="0" distL="114300" distR="114300" simplePos="0" relativeHeight="251658240" behindDoc="1" locked="0" layoutInCell="1" allowOverlap="1" wp14:anchorId="53A680AA" wp14:editId="1E9E7083">
           <wp:simplePos x="0" y="0"/>
           <wp:positionH relativeFrom="column">
             <wp:posOffset>-1085850</wp:posOffset>
@@ -3071,6 +3095,92 @@
 <file path=word/numbering.xml><?xml version="1.0" encoding="utf-8"?>
 <w:numbering xmlns:wpc="http://schemas.microsoft.com/office/word/2010/wordprocessingCanvas" xmlns:cx="http://schemas.microsoft.com/office/drawing/2014/chartex" xmlns:cx1="http://schemas.microsoft.com/office/drawing/2015/9/8/chartex" xmlns:cx2="http://schemas.microsoft.com/office/drawing/2015/10/21/chartex" xmlns:cx3="http://schemas.microsoft.com/office/drawing/2016/5/9/chartex" xmlns:cx4="http://schemas.microsoft.com/office/drawing/2016/5/10/chartex" xmlns:cx5="http://schemas.microsoft.com/office/drawing/2016/5/11/chartex" xmlns:cx6="http://schemas.microsoft.com/office/drawing/2016/5/12/chartex" xmlns:cx7="http://schemas.microsoft.com/office/drawing/2016/5/13/chartex" xmlns:cx8="http://schemas.microsoft.com/office/drawing/2016/5/14/chartex" xmlns:mc="http://schemas.openxmlformats.org/markup-compatibility/2006" xmlns:aink="http://schemas.microsoft.com/office/drawing/2016/ink" xmlns:am3d="http://schemas.microsoft.com/office/drawing/2017/model3d" xmlns:o="urn:schemas-microsoft-com:office:office" xmlns:oel="http://schemas.microsoft.com/office/2019/extlst" xmlns:r="http://schemas.openxmlformats.org/officeDocument/2006/relationships" xmlns:m="http://schemas.openxmlformats.org/officeDocument/2006/math" xmlns:v="urn:schemas-microsoft-com:vml" xmlns:wp14="http://schemas.microsoft.com/office/word/2010/wordprocessingDrawing" xmlns:wp="http://schemas.openxmlformats.org/drawingml/2006/wordprocessingDrawing" xmlns:w10="urn:schemas-microsoft-com:office:word" xmlns:w="http://schemas.openxmlformats.org/wordprocessingml/2006/main" xmlns:w14="http://schemas.microsoft.com/office/word/2010/wordml" xmlns:w15="http://schemas.microsoft.com/office/word/2012/wordml" xmlns:w16cex="http://schemas.microsoft.com/office/word/2018/wordml/cex" xmlns:w16cid="http://schemas.microsoft.com/office/word/2016/wordml/cid" xmlns:w16="http://schemas.microsoft.com/office/word/2018/wordml" xmlns:w16du="http://schemas.microsoft.com/office/word/2023/wordml/word16du" xmlns:w16sdtdh="http://schemas.microsoft.com/office/word/2020/wordml/sdtdatahash" xmlns:w16sdtfl="http://schemas.microsoft.com/office/word/2024/wordml/sdtformatlock" xmlns:w16se="http://schemas.microsoft.com/office/word/2015/wordml/symex" xmlns:wpg="http://schemas.microsoft.com/office/word/2010/wordprocessingGroup" xmlns:wpi="http://schemas.microsoft.com/office/word/2010/wordprocessingInk" xmlns:wne="http://schemas.microsoft.com/office/word/2006/wordml" xmlns:wps="http://schemas.microsoft.com/office/word/2010/wordprocessingShape" mc:Ignorable="w14 w15 w16se w16cid w16 w16cex w16sdtdh w16sdtfl w16du wp14">
   <w:abstractNum w:abstractNumId="0" w15:restartNumberingAfterBreak="0">
+    <w:nsid w:val="1145313A"/>
+    <w:multiLevelType w:val="hybridMultilevel"/>
+    <w:tmpl w:val="8AF2113E"/>
+    <w:lvl w:ilvl="0" w:tplc="0416000F">
+      <w:start w:val="1"/>
+      <w:numFmt w:val="decimal"/>
+      <w:lvlText w:val="%1."/>
+      <w:lvlJc w:val="left"/>
+      <w:pPr>
+        <w:ind w:left="720" w:hanging="360"/>
+      </w:pPr>
+    </w:lvl>
+    <w:lvl w:ilvl="1" w:tplc="04160019" w:tentative="1">
+      <w:start w:val="1"/>
+      <w:numFmt w:val="lowerLetter"/>
+      <w:lvlText w:val="%2."/>
+      <w:lvlJc w:val="left"/>
+      <w:pPr>
+        <w:ind w:left="1440" w:hanging="360"/>
+      </w:pPr>
+    </w:lvl>
+    <w:lvl w:ilvl="2" w:tplc="0416001B" w:tentative="1">
+      <w:start w:val="1"/>
+      <w:numFmt w:val="lowerRoman"/>
+      <w:lvlText w:val="%3."/>
+      <w:lvlJc w:val="right"/>
+      <w:pPr>
+        <w:ind w:left="2160" w:hanging="180"/>
+      </w:pPr>
+    </w:lvl>
+    <w:lvl w:ilvl="3" w:tplc="0416000F" w:tentative="1">
+      <w:start w:val="1"/>
+      <w:numFmt w:val="decimal"/>
+      <w:lvlText w:val="%4."/>
+      <w:lvlJc w:val="left"/>
+      <w:pPr>
+        <w:ind w:left="2880" w:hanging="360"/>
+      </w:pPr>
+    </w:lvl>
+    <w:lvl w:ilvl="4" w:tplc="04160019" w:tentative="1">
+      <w:start w:val="1"/>
+      <w:numFmt w:val="lowerLetter"/>
+      <w:lvlText w:val="%5."/>
+      <w:lvlJc w:val="left"/>
+      <w:pPr>
+        <w:ind w:left="3600" w:hanging="360"/>
+      </w:pPr>
+    </w:lvl>
+    <w:lvl w:ilvl="5" w:tplc="0416001B" w:tentative="1">
+      <w:start w:val="1"/>
+      <w:numFmt w:val="lowerRoman"/>
+      <w:lvlText w:val="%6."/>
+      <w:lvlJc w:val="right"/>
+      <w:pPr>
+        <w:ind w:left="4320" w:hanging="180"/>
+      </w:pPr>
+    </w:lvl>
+    <w:lvl w:ilvl="6" w:tplc="0416000F" w:tentative="1">
+      <w:start w:val="1"/>
+      <w:numFmt w:val="decimal"/>
+      <w:lvlText w:val="%7."/>
+      <w:lvlJc w:val="left"/>
+      <w:pPr>
+        <w:ind w:left="5040" w:hanging="360"/>
+      </w:pPr>
+    </w:lvl>
+    <w:lvl w:ilvl="7" w:tplc="04160019" w:tentative="1">
+      <w:start w:val="1"/>
+      <w:numFmt w:val="lowerLetter"/>
+      <w:lvlText w:val="%8."/>
+      <w:lvlJc w:val="left"/>
+      <w:pPr>
+        <w:ind w:left="5760" w:hanging="360"/>
+      </w:pPr>
+    </w:lvl>
+    <w:lvl w:ilvl="8" w:tplc="0416001B" w:tentative="1">
+      <w:start w:val="1"/>
+      <w:numFmt w:val="lowerRoman"/>
+      <w:lvlText w:val="%9."/>
+      <w:lvlJc w:val="right"/>
+      <w:pPr>
+        <w:ind w:left="6480" w:hanging="180"/>
+      </w:pPr>
+    </w:lvl>
+  </w:abstractNum>
+  <w:abstractNum w:abstractNumId="1" w15:restartNumberingAfterBreak="0">
     <w:nsid w:val="17913EB3"/>
     <w:multiLevelType w:val="multilevel"/>
     <w:tmpl w:val="55A8752E"/>
@@ -3156,8 +3266,279 @@
       </w:pPr>
     </w:lvl>
   </w:abstractNum>
+  <w:abstractNum w:abstractNumId="2" w15:restartNumberingAfterBreak="0">
+    <w:nsid w:val="63BD2325"/>
+    <w:multiLevelType w:val="hybridMultilevel"/>
+    <w:tmpl w:val="1B8881F4"/>
+    <w:lvl w:ilvl="0" w:tplc="04160001">
+      <w:start w:val="1"/>
+      <w:numFmt w:val="bullet"/>
+      <w:lvlText w:val=""/>
+      <w:lvlJc w:val="left"/>
+      <w:pPr>
+        <w:ind w:left="720" w:hanging="360"/>
+      </w:pPr>
+      <w:rPr>
+        <w:rFonts w:ascii="Symbol" w:hAnsi="Symbol" w:hint="default"/>
+      </w:rPr>
+    </w:lvl>
+    <w:lvl w:ilvl="1" w:tplc="04160003" w:tentative="1">
+      <w:start w:val="1"/>
+      <w:numFmt w:val="bullet"/>
+      <w:lvlText w:val="o"/>
+      <w:lvlJc w:val="left"/>
+      <w:pPr>
+        <w:ind w:left="1440" w:hanging="360"/>
+      </w:pPr>
+      <w:rPr>
+        <w:rFonts w:ascii="Courier New" w:hAnsi="Courier New" w:cs="Courier New" w:hint="default"/>
+      </w:rPr>
+    </w:lvl>
+    <w:lvl w:ilvl="2" w:tplc="04160005" w:tentative="1">
+      <w:start w:val="1"/>
+      <w:numFmt w:val="bullet"/>
+      <w:lvlText w:val=""/>
+      <w:lvlJc w:val="left"/>
+      <w:pPr>
+        <w:ind w:left="2160" w:hanging="360"/>
+      </w:pPr>
+      <w:rPr>
+        <w:rFonts w:ascii="Wingdings" w:hAnsi="Wingdings" w:hint="default"/>
+      </w:rPr>
+    </w:lvl>
+    <w:lvl w:ilvl="3" w:tplc="04160001" w:tentative="1">
+      <w:start w:val="1"/>
+      <w:numFmt w:val="bullet"/>
+      <w:lvlText w:val=""/>
+      <w:lvlJc w:val="left"/>
+      <w:pPr>
+        <w:ind w:left="2880" w:hanging="360"/>
+      </w:pPr>
+      <w:rPr>
+        <w:rFonts w:ascii="Symbol" w:hAnsi="Symbol" w:hint="default"/>
+      </w:rPr>
+    </w:lvl>
+    <w:lvl w:ilvl="4" w:tplc="04160003" w:tentative="1">
+      <w:start w:val="1"/>
+      <w:numFmt w:val="bullet"/>
+      <w:lvlText w:val="o"/>
+      <w:lvlJc w:val="left"/>
+      <w:pPr>
+        <w:ind w:left="3600" w:hanging="360"/>
+      </w:pPr>
+      <w:rPr>
+        <w:rFonts w:ascii="Courier New" w:hAnsi="Courier New" w:cs="Courier New" w:hint="default"/>
+      </w:rPr>
+    </w:lvl>
+    <w:lvl w:ilvl="5" w:tplc="04160005" w:tentative="1">
+      <w:start w:val="1"/>
+      <w:numFmt w:val="bullet"/>
+      <w:lvlText w:val=""/>
+      <w:lvlJc w:val="left"/>
+      <w:pPr>
+        <w:ind w:left="4320" w:hanging="360"/>
+      </w:pPr>
+      <w:rPr>
+        <w:rFonts w:ascii="Wingdings" w:hAnsi="Wingdings" w:hint="default"/>
+      </w:rPr>
+    </w:lvl>
+    <w:lvl w:ilvl="6" w:tplc="04160001" w:tentative="1">
+      <w:start w:val="1"/>
+      <w:numFmt w:val="bullet"/>
+      <w:lvlText w:val=""/>
+      <w:lvlJc w:val="left"/>
+      <w:pPr>
+        <w:ind w:left="5040" w:hanging="360"/>
+      </w:pPr>
+      <w:rPr>
+        <w:rFonts w:ascii="Symbol" w:hAnsi="Symbol" w:hint="default"/>
+      </w:rPr>
+    </w:lvl>
+    <w:lvl w:ilvl="7" w:tplc="04160003" w:tentative="1">
+      <w:start w:val="1"/>
+      <w:numFmt w:val="bullet"/>
+      <w:lvlText w:val="o"/>
+      <w:lvlJc w:val="left"/>
+      <w:pPr>
+        <w:ind w:left="5760" w:hanging="360"/>
+      </w:pPr>
+      <w:rPr>
+        <w:rFonts w:ascii="Courier New" w:hAnsi="Courier New" w:cs="Courier New" w:hint="default"/>
+      </w:rPr>
+    </w:lvl>
+    <w:lvl w:ilvl="8" w:tplc="04160005" w:tentative="1">
+      <w:start w:val="1"/>
+      <w:numFmt w:val="bullet"/>
+      <w:lvlText w:val=""/>
+      <w:lvlJc w:val="left"/>
+      <w:pPr>
+        <w:ind w:left="6480" w:hanging="360"/>
+      </w:pPr>
+      <w:rPr>
+        <w:rFonts w:ascii="Wingdings" w:hAnsi="Wingdings" w:hint="default"/>
+      </w:rPr>
+    </w:lvl>
+  </w:abstractNum>
+  <w:abstractNum w:abstractNumId="3" w15:restartNumberingAfterBreak="0">
+    <w:nsid w:val="7B82106F"/>
+    <w:multiLevelType w:val="multilevel"/>
+    <w:tmpl w:val="2DACAECA"/>
+    <w:lvl w:ilvl="0">
+      <w:start w:val="1"/>
+      <w:numFmt w:val="bullet"/>
+      <w:lvlText w:val=""/>
+      <w:lvlJc w:val="left"/>
+      <w:pPr>
+        <w:tabs>
+          <w:tab w:val="num" w:pos="720"/>
+        </w:tabs>
+        <w:ind w:left="720" w:hanging="360"/>
+      </w:pPr>
+      <w:rPr>
+        <w:rFonts w:ascii="Symbol" w:hAnsi="Symbol" w:hint="default"/>
+        <w:sz w:val="20"/>
+      </w:rPr>
+    </w:lvl>
+    <w:lvl w:ilvl="1" w:tentative="1">
+      <w:start w:val="1"/>
+      <w:numFmt w:val="bullet"/>
+      <w:lvlText w:val="o"/>
+      <w:lvlJc w:val="left"/>
+      <w:pPr>
+        <w:tabs>
+          <w:tab w:val="num" w:pos="1440"/>
+        </w:tabs>
+        <w:ind w:left="1440" w:hanging="360"/>
+      </w:pPr>
+      <w:rPr>
+        <w:rFonts w:ascii="Courier New" w:hAnsi="Courier New" w:hint="default"/>
+        <w:sz w:val="20"/>
+      </w:rPr>
+    </w:lvl>
+    <w:lvl w:ilvl="2" w:tentative="1">
+      <w:start w:val="1"/>
+      <w:numFmt w:val="bullet"/>
+      <w:lvlText w:val=""/>
+      <w:lvlJc w:val="left"/>
+      <w:pPr>
+        <w:tabs>
+          <w:tab w:val="num" w:pos="2160"/>
+        </w:tabs>
+        <w:ind w:left="2160" w:hanging="360"/>
+      </w:pPr>
+      <w:rPr>
+        <w:rFonts w:ascii="Wingdings" w:hAnsi="Wingdings" w:hint="default"/>
+        <w:sz w:val="20"/>
+      </w:rPr>
+    </w:lvl>
+    <w:lvl w:ilvl="3" w:tentative="1">
+      <w:start w:val="1"/>
+      <w:numFmt w:val="bullet"/>
+      <w:lvlText w:val=""/>
+      <w:lvlJc w:val="left"/>
+      <w:pPr>
+        <w:tabs>
+          <w:tab w:val="num" w:pos="2880"/>
+        </w:tabs>
+        <w:ind w:left="2880" w:hanging="360"/>
+      </w:pPr>
+      <w:rPr>
+        <w:rFonts w:ascii="Wingdings" w:hAnsi="Wingdings" w:hint="default"/>
+        <w:sz w:val="20"/>
+      </w:rPr>
+    </w:lvl>
+    <w:lvl w:ilvl="4" w:tentative="1">
+      <w:start w:val="1"/>
+      <w:numFmt w:val="bullet"/>
+      <w:lvlText w:val=""/>
+      <w:lvlJc w:val="left"/>
+      <w:pPr>
+        <w:tabs>
+          <w:tab w:val="num" w:pos="3600"/>
+        </w:tabs>
+        <w:ind w:left="3600" w:hanging="360"/>
+      </w:pPr>
+      <w:rPr>
+        <w:rFonts w:ascii="Wingdings" w:hAnsi="Wingdings" w:hint="default"/>
+        <w:sz w:val="20"/>
+      </w:rPr>
+    </w:lvl>
+    <w:lvl w:ilvl="5" w:tentative="1">
+      <w:start w:val="1"/>
+      <w:numFmt w:val="bullet"/>
+      <w:lvlText w:val=""/>
+      <w:lvlJc w:val="left"/>
+      <w:pPr>
+        <w:tabs>
+          <w:tab w:val="num" w:pos="4320"/>
+        </w:tabs>
+        <w:ind w:left="4320" w:hanging="360"/>
+      </w:pPr>
+      <w:rPr>
+        <w:rFonts w:ascii="Wingdings" w:hAnsi="Wingdings" w:hint="default"/>
+        <w:sz w:val="20"/>
+      </w:rPr>
+    </w:lvl>
+    <w:lvl w:ilvl="6" w:tentative="1">
+      <w:start w:val="1"/>
+      <w:numFmt w:val="bullet"/>
+      <w:lvlText w:val=""/>
+      <w:lvlJc w:val="left"/>
+      <w:pPr>
+        <w:tabs>
+          <w:tab w:val="num" w:pos="5040"/>
+        </w:tabs>
+        <w:ind w:left="5040" w:hanging="360"/>
+      </w:pPr>
+      <w:rPr>
+        <w:rFonts w:ascii="Wingdings" w:hAnsi="Wingdings" w:hint="default"/>
+        <w:sz w:val="20"/>
+      </w:rPr>
+    </w:lvl>
+    <w:lvl w:ilvl="7" w:tentative="1">
+      <w:start w:val="1"/>
+      <w:numFmt w:val="bullet"/>
+      <w:lvlText w:val=""/>
+      <w:lvlJc w:val="left"/>
+      <w:pPr>
+        <w:tabs>
+          <w:tab w:val="num" w:pos="5760"/>
+        </w:tabs>
+        <w:ind w:left="5760" w:hanging="360"/>
+      </w:pPr>
+      <w:rPr>
+        <w:rFonts w:ascii="Wingdings" w:hAnsi="Wingdings" w:hint="default"/>
+        <w:sz w:val="20"/>
+      </w:rPr>
+    </w:lvl>
+    <w:lvl w:ilvl="8" w:tentative="1">
+      <w:start w:val="1"/>
+      <w:numFmt w:val="bullet"/>
+      <w:lvlText w:val=""/>
+      <w:lvlJc w:val="left"/>
+      <w:pPr>
+        <w:tabs>
+          <w:tab w:val="num" w:pos="6480"/>
+        </w:tabs>
+        <w:ind w:left="6480" w:hanging="360"/>
+      </w:pPr>
+      <w:rPr>
+        <w:rFonts w:ascii="Wingdings" w:hAnsi="Wingdings" w:hint="default"/>
+        <w:sz w:val="20"/>
+      </w:rPr>
+    </w:lvl>
+  </w:abstractNum>
   <w:num w:numId="1" w16cid:durableId="897862257">
+    <w:abstractNumId w:val="1"/>
+  </w:num>
+  <w:num w:numId="2" w16cid:durableId="1859199408">
     <w:abstractNumId w:val="0"/>
+  </w:num>
+  <w:num w:numId="3" w16cid:durableId="1241646068">
+    <w:abstractNumId w:val="2"/>
+  </w:num>
+  <w:num w:numId="4" w16cid:durableId="142894298">
+    <w:abstractNumId w:val="3"/>
   </w:num>
 </w:numbering>
 </file>
@@ -4152,6 +4533,42 @@
       </w:tblBorders>
     </w:tblPr>
   </w:style>
+  <w:style w:type="paragraph" w:styleId="NormalWeb">
+    <w:name w:val="Normal (Web)"/>
+    <w:basedOn w:val="Normal"/>
+    <w:uiPriority w:val="99"/>
+    <w:semiHidden/>
+    <w:unhideWhenUsed/>
+    <w:rsid w:val="008A54A8"/>
+    <w:rPr>
+      <w:rFonts w:ascii="Times New Roman" w:hAnsi="Times New Roman" w:cs="Times New Roman"/>
+      <w:sz w:val="24"/>
+      <w:szCs w:val="24"/>
+    </w:rPr>
+  </w:style>
+  <w:style w:type="character" w:styleId="Hyperlink">
+    <w:name w:val="Hyperlink"/>
+    <w:basedOn w:val="Fontepargpadro"/>
+    <w:uiPriority w:val="99"/>
+    <w:unhideWhenUsed/>
+    <w:rsid w:val="008A54A8"/>
+    <w:rPr>
+      <w:color w:val="467886" w:themeColor="hyperlink"/>
+      <w:u w:val="single"/>
+    </w:rPr>
+  </w:style>
+  <w:style w:type="character" w:styleId="MenoPendente">
+    <w:name w:val="Unresolved Mention"/>
+    <w:basedOn w:val="Fontepargpadro"/>
+    <w:uiPriority w:val="99"/>
+    <w:semiHidden/>
+    <w:unhideWhenUsed/>
+    <w:rsid w:val="008A54A8"/>
+    <w:rPr>
+      <w:color w:val="605E5C"/>
+      <w:shd w:val="clear" w:color="auto" w:fill="E1DFDD"/>
+    </w:rPr>
+  </w:style>
 </w:styles>
 </file>
 

</xml_diff>

<commit_message>
Atualizei o documento de extensão COM empresa
Atualizei o documento de extensão COM empresa
</commit_message>
<xml_diff>
--- a/Documento - Projeto de Extensão - COM Empresa - 2026_1.docx
+++ b/Documento - Projeto de Extensão - COM Empresa - 2026_1.docx
@@ -5,6 +5,7 @@
     <w:p>
       <w:pPr>
         <w:spacing w:after="0" w:line="240" w:lineRule="auto"/>
+        <w:ind w:firstLine="708"/>
         <w:jc w:val="center"/>
         <w:rPr>
           <w:rFonts w:ascii="Arial" w:eastAsia="Arial" w:hAnsi="Arial" w:cs="Arial"/>
@@ -145,7 +146,7 @@
                 <w:sz w:val="20"/>
                 <w:szCs w:val="20"/>
               </w:rPr>
-              <w:t>Desenvolvimento de um Protótipo Navegável para a Plataforma TicketLab</w:t>
+              <w:t>Desenvolvimento da Plataforma Web TicketLab para Organização e Gestão de Eventos</w:t>
             </w:r>
           </w:p>
         </w:tc>
@@ -177,7 +178,6 @@
         <w:rPr>
           <w:rFonts w:ascii="Arial" w:eastAsia="Arial" w:hAnsi="Arial" w:cs="Arial"/>
           <w:b/>
-          <w:color w:val="0C3512" w:themeColor="accent3" w:themeShade="80"/>
           <w:sz w:val="20"/>
           <w:szCs w:val="20"/>
         </w:rPr>
@@ -465,51 +465,6 @@
               </w:rPr>
               <w:t>26028462</w:t>
             </w:r>
-          </w:p>
-        </w:tc>
-      </w:tr>
-      <w:tr>
-        <w:tc>
-          <w:tcPr>
-            <w:tcW w:w="6675" w:type="dxa"/>
-          </w:tcPr>
-          <w:p>
-            <w:pPr>
-              <w:spacing w:after="0" w:line="240" w:lineRule="auto"/>
-              <w:rPr>
-                <w:rFonts w:ascii="Arial" w:eastAsia="Arial" w:hAnsi="Arial" w:cs="Arial"/>
-                <w:b/>
-                <w:sz w:val="20"/>
-                <w:szCs w:val="20"/>
-              </w:rPr>
-            </w:pPr>
-          </w:p>
-          <w:p>
-            <w:pPr>
-              <w:spacing w:after="0" w:line="240" w:lineRule="auto"/>
-              <w:rPr>
-                <w:rFonts w:ascii="Arial" w:eastAsia="Arial" w:hAnsi="Arial" w:cs="Arial"/>
-                <w:b/>
-                <w:sz w:val="20"/>
-                <w:szCs w:val="20"/>
-              </w:rPr>
-            </w:pPr>
-          </w:p>
-        </w:tc>
-        <w:tc>
-          <w:tcPr>
-            <w:tcW w:w="2700" w:type="dxa"/>
-          </w:tcPr>
-          <w:p>
-            <w:pPr>
-              <w:spacing w:after="0" w:line="240" w:lineRule="auto"/>
-              <w:rPr>
-                <w:rFonts w:ascii="Arial" w:eastAsia="Arial" w:hAnsi="Arial" w:cs="Arial"/>
-                <w:b/>
-                <w:sz w:val="20"/>
-                <w:szCs w:val="20"/>
-              </w:rPr>
-            </w:pPr>
           </w:p>
         </w:tc>
       </w:tr>
@@ -1131,18 +1086,6 @@
     </w:p>
     <w:p>
       <w:pPr>
-        <w:spacing w:before="240" w:after="0"/>
-        <w:jc w:val="both"/>
-        <w:rPr>
-          <w:rFonts w:ascii="Arial" w:eastAsia="Arial" w:hAnsi="Arial" w:cs="Arial"/>
-          <w:b/>
-          <w:sz w:val="20"/>
-          <w:szCs w:val="20"/>
-        </w:rPr>
-      </w:pPr>
-    </w:p>
-    <w:p>
-      <w:pPr>
         <w:spacing w:after="0" w:line="240" w:lineRule="auto"/>
         <w:rPr>
           <w:rFonts w:ascii="Arial" w:eastAsia="Arial" w:hAnsi="Arial" w:cs="Arial"/>
@@ -1225,6 +1168,47 @@
               <w:spacing w:after="0" w:line="240" w:lineRule="auto"/>
               <w:rPr>
                 <w:rFonts w:ascii="Arial" w:eastAsia="Arial" w:hAnsi="Arial" w:cs="Arial"/>
+                <w:sz w:val="20"/>
+                <w:szCs w:val="20"/>
+              </w:rPr>
+            </w:pPr>
+            <w:r>
+              <w:rPr>
+                <w:rFonts w:ascii="Arial" w:eastAsia="Arial" w:hAnsi="Arial" w:cs="Arial"/>
+                <w:sz w:val="20"/>
+                <w:szCs w:val="20"/>
+              </w:rPr>
+              <w:t>A plataforma digital TicketLab foi implementada como uma aplicação web destinada a organizadores de eventos, fornecedores e administradores</w:t>
+            </w:r>
+            <w:r>
+              <w:rPr>
+                <w:rFonts w:ascii="Arial" w:eastAsia="Arial" w:hAnsi="Arial" w:cs="Arial"/>
+                <w:sz w:val="20"/>
+                <w:szCs w:val="20"/>
+              </w:rPr>
+              <w:t xml:space="preserve"> </w:t>
+            </w:r>
+            <w:r>
+              <w:rPr>
+                <w:rFonts w:ascii="Arial" w:eastAsia="Arial" w:hAnsi="Arial" w:cs="Arial"/>
+                <w:sz w:val="20"/>
+                <w:szCs w:val="20"/>
+              </w:rPr>
+              <w:t>com o objetivo de facilitar a organização e o gerenciamento de eventos.</w:t>
+            </w:r>
+          </w:p>
+          <w:p>
+            <w:pPr>
+              <w:pBdr>
+                <w:top w:val="nil"/>
+                <w:left w:val="nil"/>
+                <w:bottom w:val="nil"/>
+                <w:right w:val="nil"/>
+                <w:between w:val="nil"/>
+              </w:pBdr>
+              <w:spacing w:after="0" w:line="240" w:lineRule="auto"/>
+              <w:rPr>
+                <w:rFonts w:ascii="Arial" w:eastAsia="Arial" w:hAnsi="Arial" w:cs="Arial"/>
                 <w:color w:val="FF3333"/>
                 <w:sz w:val="20"/>
                 <w:szCs w:val="20"/>
@@ -1236,34 +1220,33 @@
                 <w:sz w:val="20"/>
                 <w:szCs w:val="20"/>
               </w:rPr>
-              <w:t>A plataforma digital TicketLab será destinada a organizadores de eventos, fornecedores e administradores.</w:t>
-            </w:r>
-            <w:r>
-              <w:rPr>
-                <w:rFonts w:ascii="Arial" w:eastAsia="Arial" w:hAnsi="Arial" w:cs="Arial"/>
-                <w:sz w:val="20"/>
-                <w:szCs w:val="20"/>
-              </w:rPr>
-              <w:br/>
-              <w:t>O sistema web permitirá cadastros e acesso às funcionalidades de cada perfil.</w:t>
-            </w:r>
-            <w:r>
-              <w:rPr>
-                <w:rFonts w:ascii="Arial" w:eastAsia="Arial" w:hAnsi="Arial" w:cs="Arial"/>
-                <w:sz w:val="20"/>
-                <w:szCs w:val="20"/>
-              </w:rPr>
-              <w:br/>
-              <w:t>A proposta busca facilitar a organização e o gerenciamento de eventos.</w:t>
-            </w:r>
-            <w:r>
-              <w:rPr>
-                <w:rFonts w:ascii="Arial" w:eastAsia="Arial" w:hAnsi="Arial" w:cs="Arial"/>
-                <w:sz w:val="20"/>
-                <w:szCs w:val="20"/>
-              </w:rPr>
-              <w:br/>
-              <w:t>Inicialmente, o protótipo será testado localmente, com baixo custo de implementação.</w:t>
+              <w:t>O sistema permite cadastro, login e acesso às funcionalidades de cada perfil, com acesso condicionado à aprovação do cadastro pelo administrador.</w:t>
+            </w:r>
+          </w:p>
+          <w:p>
+            <w:pPr>
+              <w:pBdr>
+                <w:top w:val="nil"/>
+                <w:left w:val="nil"/>
+                <w:bottom w:val="nil"/>
+                <w:right w:val="nil"/>
+                <w:between w:val="nil"/>
+              </w:pBdr>
+              <w:spacing w:after="0" w:line="240" w:lineRule="auto"/>
+              <w:rPr>
+                <w:rFonts w:ascii="Arial" w:eastAsia="Arial" w:hAnsi="Arial" w:cs="Arial"/>
+                <w:color w:val="FF3333"/>
+                <w:sz w:val="20"/>
+                <w:szCs w:val="20"/>
+              </w:rPr>
+            </w:pPr>
+            <w:r>
+              <w:rPr>
+                <w:rFonts w:ascii="Arial" w:eastAsia="Arial" w:hAnsi="Arial" w:cs="Arial"/>
+                <w:sz w:val="20"/>
+                <w:szCs w:val="20"/>
+              </w:rPr>
+              <w:t>A solução foi desenvolvida e executada em ambiente local (interface em React, API em Node.js e banco de dados MySQL), com baixo custo de implementação, pois utilizou apenas ferramentas gratuitas e de código aberto.</w:t>
             </w:r>
           </w:p>
         </w:tc>
@@ -1286,6 +1269,28 @@
         <w:rPr>
           <w:rFonts w:ascii="Arial" w:eastAsia="Arial" w:hAnsi="Arial" w:cs="Arial"/>
           <w:b/>
+          <w:sz w:val="20"/>
+          <w:szCs w:val="20"/>
+        </w:rPr>
+      </w:pPr>
+    </w:p>
+    <w:p>
+      <w:pPr>
+        <w:spacing w:after="0" w:line="240" w:lineRule="auto"/>
+        <w:rPr>
+          <w:rFonts w:ascii="Arial" w:eastAsia="Arial" w:hAnsi="Arial" w:cs="Arial"/>
+          <w:b/>
+          <w:sz w:val="20"/>
+          <w:szCs w:val="20"/>
+        </w:rPr>
+      </w:pPr>
+    </w:p>
+    <w:p>
+      <w:pPr>
+        <w:spacing w:after="0" w:line="240" w:lineRule="auto"/>
+        <w:rPr>
+          <w:rFonts w:ascii="Arial" w:eastAsia="Arial" w:hAnsi="Arial" w:cs="Arial"/>
+          <w:b/>
           <w:color w:val="FF3333"/>
           <w:sz w:val="16"/>
           <w:szCs w:val="16"/>
@@ -1298,6 +1303,7 @@
           <w:sz w:val="20"/>
           <w:szCs w:val="20"/>
         </w:rPr>
+        <w:lastRenderedPageBreak/>
         <w:t>Público-alvo a ser atendido pelo projeto</w:t>
       </w:r>
     </w:p>
@@ -1332,41 +1338,92 @@
               </w:pBdr>
               <w:spacing w:after="0" w:line="240" w:lineRule="auto"/>
               <w:rPr>
-                <w:sz w:val="20"/>
-                <w:szCs w:val="20"/>
-              </w:rPr>
-            </w:pPr>
-            <w:r>
-              <w:rPr>
-                <w:sz w:val="20"/>
-                <w:szCs w:val="20"/>
-              </w:rPr>
-              <w:lastRenderedPageBreak/>
-              <w:t>O público-alvo será composto por organizadores de eventos, fornecedores de serviços e administradores da plataforma TicketLab.</w:t>
-            </w:r>
-            <w:r>
-              <w:rPr>
-                <w:sz w:val="20"/>
-                <w:szCs w:val="20"/>
-              </w:rPr>
-              <w:br/>
-              <w:t>O sistema atenderá pessoas que buscam facilitar a organização e o gerenciamento de eventos.</w:t>
-            </w:r>
-            <w:r>
-              <w:rPr>
-                <w:sz w:val="20"/>
-                <w:szCs w:val="20"/>
-              </w:rPr>
-              <w:br/>
-              <w:t>Os usuários poderão ter diferentes níveis de experiência e conhecimento tecnológico.</w:t>
-            </w:r>
-            <w:r>
-              <w:rPr>
-                <w:sz w:val="20"/>
-                <w:szCs w:val="20"/>
-              </w:rPr>
-              <w:br/>
-              <w:t>A plataforma pretende oferecer uma navegação simples, acessível e adequada às necessidades de cada perfil.</w:t>
+                <w:rFonts w:ascii="Arial" w:hAnsi="Arial" w:cs="Arial"/>
+                <w:sz w:val="20"/>
+                <w:szCs w:val="20"/>
+              </w:rPr>
+            </w:pPr>
+            <w:r>
+              <w:rPr>
+                <w:rFonts w:ascii="Arial" w:hAnsi="Arial" w:cs="Arial"/>
+                <w:sz w:val="20"/>
+                <w:szCs w:val="20"/>
+              </w:rPr>
+              <w:t>O público-alvo é composto por organizadores de eventos, fornecedores de serviços e administradores da plataforma TicketLab.</w:t>
+            </w:r>
+          </w:p>
+          <w:p>
+            <w:pPr>
+              <w:pBdr>
+                <w:top w:val="nil"/>
+                <w:left w:val="nil"/>
+                <w:bottom w:val="nil"/>
+                <w:right w:val="nil"/>
+                <w:between w:val="nil"/>
+              </w:pBdr>
+              <w:spacing w:after="0" w:line="240" w:lineRule="auto"/>
+              <w:rPr>
+                <w:rFonts w:ascii="Arial" w:hAnsi="Arial" w:cs="Arial"/>
+                <w:sz w:val="20"/>
+                <w:szCs w:val="20"/>
+              </w:rPr>
+            </w:pPr>
+            <w:r>
+              <w:rPr>
+                <w:rFonts w:ascii="Arial" w:hAnsi="Arial" w:cs="Arial"/>
+                <w:sz w:val="20"/>
+                <w:szCs w:val="20"/>
+              </w:rPr>
+              <w:t>O sistema atende pessoas que buscam facilitar a organização e o gerenciamento de eventos.</w:t>
+            </w:r>
+          </w:p>
+          <w:p>
+            <w:pPr>
+              <w:pBdr>
+                <w:top w:val="nil"/>
+                <w:left w:val="nil"/>
+                <w:bottom w:val="nil"/>
+                <w:right w:val="nil"/>
+                <w:between w:val="nil"/>
+              </w:pBdr>
+              <w:spacing w:after="0" w:line="240" w:lineRule="auto"/>
+              <w:rPr>
+                <w:rFonts w:ascii="Arial" w:hAnsi="Arial" w:cs="Arial"/>
+                <w:sz w:val="20"/>
+                <w:szCs w:val="20"/>
+              </w:rPr>
+            </w:pPr>
+            <w:r>
+              <w:rPr>
+                <w:rFonts w:ascii="Arial" w:hAnsi="Arial" w:cs="Arial"/>
+                <w:sz w:val="20"/>
+                <w:szCs w:val="20"/>
+              </w:rPr>
+              <w:t>Os usuários podem ter diferentes níveis de experiência e conhecimento tecnológico</w:t>
+            </w:r>
+            <w:r>
+              <w:rPr>
+                <w:rFonts w:ascii="Arial" w:hAnsi="Arial" w:cs="Arial"/>
+                <w:sz w:val="20"/>
+                <w:szCs w:val="20"/>
+              </w:rPr>
+              <w:t xml:space="preserve">, </w:t>
+            </w:r>
+            <w:r>
+              <w:rPr>
+                <w:rFonts w:ascii="Arial" w:hAnsi="Arial" w:cs="Arial"/>
+                <w:sz w:val="20"/>
+                <w:szCs w:val="20"/>
+              </w:rPr>
+              <w:t>por isso, a plataforma oferece uma navegação simples, acessível e adequada às necessidades de cada perfil</w:t>
+            </w:r>
+            <w:r>
+              <w:rPr>
+                <w:rFonts w:ascii="Arial" w:hAnsi="Arial" w:cs="Arial"/>
+                <w:sz w:val="20"/>
+                <w:szCs w:val="20"/>
+              </w:rPr>
+              <w:t>.</w:t>
             </w:r>
           </w:p>
         </w:tc>
@@ -1447,7 +1504,34 @@
                 <w:sz w:val="20"/>
                 <w:szCs w:val="20"/>
               </w:rPr>
-              <w:t>Foi identificada a necessidade de facilitar a comunicação e a organização entre organizadores de eventos e fornecedores. A falta de uma plataforma centralizada pode dificultar o gerenciamento das informações e dos serviços. O projeto TicketLab busca solucionar esse problema por meio de um sistema web com funcionalidades específicas para cada perfil. A intervenção será delimitada ao desenvolvimento de um protótipo navegável que demonstre essas funcionalidades.</w:t>
+              <w:t>Foi identificada a necessidade de facilitar a comunicação e a organização entre organizadores de eventos e fornecedores. A falta de uma plataforma centralizada dificulta o gerenciamento das informações, a cotação de serviços e a estimativa dos custos do evento. O projeto TicketLab buscou solucionar esse problema por meio de um sistema web com funcionalidades específicas para cada perfil.</w:t>
+            </w:r>
+          </w:p>
+          <w:p>
+            <w:pPr>
+              <w:pBdr>
+                <w:top w:val="nil"/>
+                <w:left w:val="nil"/>
+                <w:bottom w:val="nil"/>
+                <w:right w:val="nil"/>
+                <w:between w:val="nil"/>
+              </w:pBdr>
+              <w:spacing w:after="0" w:line="240" w:lineRule="auto"/>
+              <w:jc w:val="both"/>
+              <w:rPr>
+                <w:rFonts w:ascii="Arial" w:eastAsia="Arial" w:hAnsi="Arial" w:cs="Arial"/>
+                <w:color w:val="1F4E79"/>
+                <w:sz w:val="20"/>
+                <w:szCs w:val="20"/>
+              </w:rPr>
+            </w:pPr>
+            <w:r>
+              <w:rPr>
+                <w:rFonts w:ascii="Arial" w:eastAsia="Arial" w:hAnsi="Arial" w:cs="Arial"/>
+                <w:sz w:val="20"/>
+                <w:szCs w:val="20"/>
+              </w:rPr>
+              <w:t>A intervenção foi delimitada ao planejamento do evento, à cotação de fornecedores e à estimativa do valor do ingresso. O sistema não realiza venda de ingressos nem processamento de pagamentos.</w:t>
             </w:r>
           </w:p>
         </w:tc>
@@ -1528,7 +1612,34 @@
                 <w:sz w:val="20"/>
                 <w:szCs w:val="20"/>
               </w:rPr>
-              <w:t>A criação da plataforma TicketLab pode facilitar a comunicação entre organizadores de eventos e fornecedores, centralizando informações e funcionalidades em um único sistema. A hipótese é que uma interface intuitiva, com cadastros e áreas específicas para cada perfil, torne o gerenciamento mais simples e eficiente. A solução escolhida é o desenvolvimento de um protótipo navegável, viável economicamente e que permita testar os principais fluxos antes da implementação completa.</w:t>
+              <w:t>A hipótese adotada foi a de que centralizar informações e funcionalidades em um único sistema, com áreas específicas para cada perfil, torna o gerenciamento de eventos mais simples e eficiente.</w:t>
+            </w:r>
+          </w:p>
+          <w:p>
+            <w:pPr>
+              <w:pBdr>
+                <w:top w:val="nil"/>
+                <w:left w:val="nil"/>
+                <w:bottom w:val="nil"/>
+                <w:right w:val="nil"/>
+                <w:between w:val="nil"/>
+              </w:pBdr>
+              <w:spacing w:after="0" w:line="240" w:lineRule="auto"/>
+              <w:jc w:val="both"/>
+              <w:rPr>
+                <w:rFonts w:ascii="Arial" w:eastAsia="Arial" w:hAnsi="Arial" w:cs="Arial"/>
+                <w:color w:val="FF3333"/>
+                <w:sz w:val="20"/>
+                <w:szCs w:val="20"/>
+              </w:rPr>
+            </w:pPr>
+            <w:r>
+              <w:rPr>
+                <w:rFonts w:ascii="Arial" w:eastAsia="Arial" w:hAnsi="Arial" w:cs="Arial"/>
+                <w:sz w:val="20"/>
+                <w:szCs w:val="20"/>
+              </w:rPr>
+              <w:t>Para verificá-la, foi desenvolvida uma aplicação web completa, com interface, API e banco de dados, economicamente viável e capaz de percorrer os principais fluxos: cadastro e aprovação de usuários, cadastro de eventos, envio de propostas pelos fornecedores e cálculo do valor do ingresso.</w:t>
             </w:r>
           </w:p>
         </w:tc>
@@ -1642,25 +1753,47 @@
                 <w:sz w:val="20"/>
                 <w:szCs w:val="20"/>
               </w:rPr>
-              <w:t xml:space="preserve">O projeto TicketLab consiste no desenvolvimento de um protótipo navegável de uma plataforma web voltada à organização de eventos, conectando organizadores, fornecedores e administradores. A proposta busca facilitar o gerenciamento de informações e serviços por meio de uma interface intuitiva e funcionalidades específicas para cada perfil. O público-alvo inclui pessoas envolvidas na organização e prestação de serviços para eventos. A metodologia envolve o planejamento das telas, o desenvolvimento do protótipo no </w:t>
-            </w:r>
-            <w:proofErr w:type="spellStart"/>
-            <w:r>
-              <w:rPr>
-                <w:rFonts w:ascii="Arial" w:eastAsia="Arial" w:hAnsi="Arial" w:cs="Arial"/>
-                <w:sz w:val="20"/>
-                <w:szCs w:val="20"/>
-              </w:rPr>
-              <w:t>Bolt.new</w:t>
-            </w:r>
-            <w:proofErr w:type="spellEnd"/>
-            <w:r>
-              <w:rPr>
-                <w:rFonts w:ascii="Arial" w:eastAsia="Arial" w:hAnsi="Arial" w:cs="Arial"/>
-                <w:sz w:val="20"/>
-                <w:szCs w:val="20"/>
-              </w:rPr>
-              <w:t xml:space="preserve"> e a realização de testes de navegação. Espera-se demonstrar uma solução tecnológica viável, acessível e capaz de melhorar a organização dos processos relacionados a eventos.</w:t>
+              <w:t>O projeto TicketLab consistiu no desenvolvimento de uma plataforma web para a organização de eventos, conectando organizadores, fornecedores e administradores. O sistema foi construído com interface em React, API REST em Node.js e Express e banco de dados MySQL, com autenticação por token JWT e controle de acesso por perfil.</w:t>
+            </w:r>
+          </w:p>
+          <w:p>
+            <w:pPr>
+              <w:spacing w:after="0" w:line="240" w:lineRule="auto"/>
+              <w:jc w:val="both"/>
+              <w:rPr>
+                <w:rFonts w:ascii="Arial" w:eastAsia="Arial" w:hAnsi="Arial" w:cs="Arial"/>
+                <w:color w:val="000000"/>
+                <w:sz w:val="20"/>
+                <w:szCs w:val="20"/>
+              </w:rPr>
+            </w:pPr>
+            <w:r>
+              <w:rPr>
+                <w:rFonts w:ascii="Arial" w:eastAsia="Arial" w:hAnsi="Arial" w:cs="Arial"/>
+                <w:sz w:val="20"/>
+                <w:szCs w:val="20"/>
+              </w:rPr>
+              <w:t>O administrador aprova ou rejeita cadastros e acompanha usuários, eventos e relatórios; o organizador cadastra eventos e estima o valor do ingresso a partir dos custos, do público e da margem; o fornecedor gerencia seus serviços e envia propostas para eventos em planejamento.</w:t>
+            </w:r>
+          </w:p>
+          <w:p>
+            <w:pPr>
+              <w:spacing w:after="0" w:line="240" w:lineRule="auto"/>
+              <w:jc w:val="both"/>
+              <w:rPr>
+                <w:rFonts w:ascii="Arial" w:eastAsia="Arial" w:hAnsi="Arial" w:cs="Arial"/>
+                <w:color w:val="000000"/>
+                <w:sz w:val="20"/>
+                <w:szCs w:val="20"/>
+              </w:rPr>
+            </w:pPr>
+            <w:r>
+              <w:rPr>
+                <w:rFonts w:ascii="Arial" w:eastAsia="Arial" w:hAnsi="Arial" w:cs="Arial"/>
+                <w:sz w:val="20"/>
+                <w:szCs w:val="20"/>
+              </w:rPr>
+              <w:t>A metodologia envolveu levantamento de requisitos, prototipação, modelagem do banco de dados, desenvolvimento do back-end e do front-end, integração entre as camadas e testes. Como resultado, obteve-se uma solução tecnológica funcional, acessível e de baixo custo para melhorar a organização dos processos relacionados a eventos.</w:t>
             </w:r>
           </w:p>
         </w:tc>
@@ -1734,25 +1867,26 @@
                 <w:sz w:val="20"/>
                 <w:szCs w:val="20"/>
               </w:rPr>
-              <w:t xml:space="preserve">O avanço das tecnologias digitais tem possibilitado o desenvolvimento de plataformas que facilitam a comunicação, a organização e o gerenciamento de atividades. Nesse contexto, o projeto TicketLab propõe um protótipo navegável de um sistema web destinado a organizadores de eventos, fornecedores de serviços e administradores, buscando centralizar funcionalidades e simplificar processos. Segundo a ISO (2018), a usabilidade de um sistema está relacionada à sua eficácia, eficiência e satisfação durante a utilização, aspectos considerados no planejamento das telas e dos fluxos de navegação. O projeto relaciona-se ao </w:t>
-            </w:r>
-            <w:r>
-              <w:rPr>
-                <w:rFonts w:ascii="Arial" w:eastAsia="Arial" w:hAnsi="Arial" w:cs="Arial"/>
-                <w:b/>
-                <w:bCs/>
-                <w:sz w:val="20"/>
-                <w:szCs w:val="20"/>
-              </w:rPr>
-              <w:t>ODS 9 — Indústria, Inovação e Infraestrutura</w:t>
-            </w:r>
-            <w:r>
-              <w:rPr>
-                <w:rFonts w:ascii="Arial" w:eastAsia="Arial" w:hAnsi="Arial" w:cs="Arial"/>
-                <w:sz w:val="20"/>
-                <w:szCs w:val="20"/>
-              </w:rPr>
-              <w:t>, da Organização das Nações Unidas, por incentivar o desenvolvimento e a aplicação de soluções tecnológicas inovadoras (ONU, s.d.). Espera-se demonstrar a viabilidade da proposta e contribuir para uma experiência de utilização mais simples e organizada.</w:t>
+              <w:t>O avanço das tecnologias digitais tem possibilitado o desenvolvimento de plataformas que facilitam a comunicação, a organização e o gerenciamento de atividades. Nesse contexto, o projeto TicketLab propõe uma plataforma web destinada a organizadores de eventos, fornecedores de serviços e administradores, buscando centralizar funcionalidades e simplificar processos. Segundo a ISO (2018), a usabilidade de um sistema está relacionada à sua eficácia, eficiência e satisfação durante a utilização, aspectos considerados no planejamento das telas e dos fluxos de navegação. O projeto relaciona-se ao ODS 9 — Indústria, Inovação e Infraestrutura, da Organização das Nações Unidas, por incentivar o desenvolvimento e a aplicação de soluções tecnológicas inovadoras (ONU, s.d.).</w:t>
+            </w:r>
+          </w:p>
+          <w:p>
+            <w:pPr>
+              <w:spacing w:after="0" w:line="240" w:lineRule="auto"/>
+              <w:jc w:val="both"/>
+              <w:rPr>
+                <w:rFonts w:ascii="Arial" w:eastAsia="Arial" w:hAnsi="Arial" w:cs="Arial"/>
+                <w:sz w:val="20"/>
+                <w:szCs w:val="20"/>
+              </w:rPr>
+            </w:pPr>
+            <w:r>
+              <w:rPr>
+                <w:rFonts w:ascii="Arial" w:eastAsia="Arial" w:hAnsi="Arial" w:cs="Arial"/>
+                <w:sz w:val="20"/>
+                <w:szCs w:val="20"/>
+              </w:rPr>
+              <w:t>A plataforma foi concebida como um produto mínimo viável (MVP), com foco no planejamento do evento, na cotação de fornecedores e na estimativa do valor do ingresso.</w:t>
             </w:r>
           </w:p>
         </w:tc>
@@ -1871,7 +2005,7 @@
                 <w:sz w:val="20"/>
                 <w:szCs w:val="20"/>
               </w:rPr>
-              <w:t>Desenvolver um protótipo navegável da plataforma TicketLab para facilitar a organização e a gestão de informações entre organizadores de eventos, fornecedores e administradores.</w:t>
+              <w:t>Desenvolver a plataforma web TicketLab para facilitar a organização e a gestão de informações entre organizadores de eventos, fornecedores e administradores.</w:t>
             </w:r>
           </w:p>
           <w:p>
@@ -1921,7 +2055,7 @@
                 <w:sz w:val="20"/>
                 <w:szCs w:val="20"/>
               </w:rPr>
-              <w:t>Desenvolver telas de login e cadastro para os usuários.</w:t>
+              <w:t>Implementar o cadastro, a autenticação e o controle de acesso por perfil (administrador, organizador e fornecedor).</w:t>
             </w:r>
           </w:p>
           <w:p>
@@ -1947,7 +2081,8 @@
                 <w:sz w:val="20"/>
                 <w:szCs w:val="20"/>
               </w:rPr>
-              <w:t>Representar as funcionalidades específicas de cada perfil.</w:t>
+              <w:lastRenderedPageBreak/>
+              <w:t>Desenvolver a área do administrador para aprovação de cadastros e acompanhamento de usuários, eventos e relatórios.</w:t>
             </w:r>
           </w:p>
           <w:p>
@@ -1973,7 +2108,7 @@
                 <w:sz w:val="20"/>
                 <w:szCs w:val="20"/>
               </w:rPr>
-              <w:t>Criar uma navegação intuitiva entre as páginas do sistema.</w:t>
+              <w:t>Desenvolver a área do organizador para cadastro de eventos e estimativa do valor do ingresso.</w:t>
             </w:r>
           </w:p>
           <w:p>
@@ -1999,7 +2134,7 @@
                 <w:sz w:val="20"/>
                 <w:szCs w:val="20"/>
               </w:rPr>
-              <w:t>Demonstrar os principais fluxos de utilização por meio do protótipo.</w:t>
+              <w:t>Desenvolver a área do fornecedor para gestão de serviços, consulta de oportunidades e envio de propostas.</w:t>
             </w:r>
           </w:p>
           <w:p>
@@ -2025,7 +2160,33 @@
                 <w:sz w:val="20"/>
                 <w:szCs w:val="20"/>
               </w:rPr>
-              <w:t>Verificar a navegação e identificar possíveis melhorias na interface.</w:t>
+              <w:t>Modelar o banco de dados MySQL e construir a API REST que integra as telas aos dados.</w:t>
+            </w:r>
+          </w:p>
+          <w:p>
+            <w:pPr>
+              <w:numPr>
+                <w:ilvl w:val="0"/>
+                <w:numId w:val="4"/>
+              </w:numPr>
+              <w:tabs>
+                <w:tab w:val="left" w:pos="360"/>
+              </w:tabs>
+              <w:spacing w:after="0" w:line="240" w:lineRule="auto"/>
+              <w:jc w:val="both"/>
+              <w:rPr>
+                <w:rFonts w:ascii="Arial" w:eastAsia="Arial" w:hAnsi="Arial" w:cs="Arial"/>
+                <w:sz w:val="20"/>
+                <w:szCs w:val="20"/>
+              </w:rPr>
+            </w:pPr>
+            <w:r>
+              <w:rPr>
+                <w:rFonts w:ascii="Arial" w:eastAsia="Arial" w:hAnsi="Arial" w:cs="Arial"/>
+                <w:sz w:val="20"/>
+                <w:szCs w:val="20"/>
+              </w:rPr>
+              <w:t>Verificar o funcionamento dos fluxos por meio de testes e identificar melhorias.</w:t>
             </w:r>
           </w:p>
         </w:tc>
@@ -2096,26 +2257,45 @@
                 <w:sz w:val="20"/>
                 <w:szCs w:val="20"/>
               </w:rPr>
-              <w:lastRenderedPageBreak/>
-              <w:t xml:space="preserve">O projeto será desenvolvido em ambiente computacional, utilizando a ferramenta </w:t>
-            </w:r>
-            <w:proofErr w:type="spellStart"/>
-            <w:r>
-              <w:rPr>
-                <w:rFonts w:ascii="Arial" w:eastAsia="Arial" w:hAnsi="Arial" w:cs="Arial"/>
-                <w:sz w:val="20"/>
-                <w:szCs w:val="20"/>
-              </w:rPr>
-              <w:t>Bolt.new</w:t>
-            </w:r>
-            <w:proofErr w:type="spellEnd"/>
-            <w:r>
-              <w:rPr>
-                <w:rFonts w:ascii="Arial" w:eastAsia="Arial" w:hAnsi="Arial" w:cs="Arial"/>
-                <w:sz w:val="20"/>
-                <w:szCs w:val="20"/>
-              </w:rPr>
-              <w:t xml:space="preserve"> para a criação do protótipo web TicketLab. Inicialmente, serão definidos os requisitos e os principais fluxos de navegação, considerando as necessidades de organizadores de eventos, fornecedores e administradores. Em seguida, serão elaboradas as telas da página inicial, login, escolha do tipo de cadastro, cadastro de organizadores e fornecedores, áreas específicas de cada perfil e página de erro 404. Após o desenvolvimento, serão realizados testes de navegação para verificar o funcionamento dos links, a organização das telas e a facilidade de utilização. Como forma de avaliação, poderão ser coletadas opiniões de usuários por meio de questionários ou conversas, permitindo identificar dificuldades e oportunidades de melhoria. Os resultados servirão de base para aperfeiçoar o protótipo e avaliar sua adequação à proposta do projeto.</w:t>
+              <w:t>O projeto foi desenvolvido em ambiente computacional, em etapas. Primeiro, foram definidos os requisitos e os principais fluxos de navegação de cada perfil, e foi elaborado um protótipo navegável na ferramenta Bolt para validar as telas.</w:t>
+            </w:r>
+          </w:p>
+          <w:p>
+            <w:pPr>
+              <w:spacing w:after="0" w:line="240" w:lineRule="auto"/>
+              <w:jc w:val="both"/>
+              <w:rPr>
+                <w:rFonts w:ascii="Arial" w:eastAsia="Arial" w:hAnsi="Arial" w:cs="Arial"/>
+                <w:sz w:val="20"/>
+                <w:szCs w:val="20"/>
+              </w:rPr>
+            </w:pPr>
+            <w:r>
+              <w:rPr>
+                <w:rFonts w:ascii="Arial" w:eastAsia="Arial" w:hAnsi="Arial" w:cs="Arial"/>
+                <w:sz w:val="20"/>
+                <w:szCs w:val="20"/>
+              </w:rPr>
+              <w:t>Em seguida, foi feita a modelagem do banco de dados MySQL (usuários, organizadores, fornecedores, eventos, serviços, preços e propostas) e a API REST foi construída com Node.js e Express, com senhas protegidas por hash (bcrypt) e autenticação por token JWT. A interface foi desenvolvida em React com Vite e integrada à API, e as alterações do banco foram versionadas em scripts de migração.</w:t>
+            </w:r>
+          </w:p>
+          <w:p>
+            <w:pPr>
+              <w:spacing w:after="0" w:line="240" w:lineRule="auto"/>
+              <w:jc w:val="both"/>
+              <w:rPr>
+                <w:rFonts w:ascii="Arial" w:eastAsia="Arial" w:hAnsi="Arial" w:cs="Arial"/>
+                <w:sz w:val="20"/>
+                <w:szCs w:val="20"/>
+              </w:rPr>
+            </w:pPr>
+            <w:r>
+              <w:rPr>
+                <w:rFonts w:ascii="Arial" w:eastAsia="Arial" w:hAnsi="Arial" w:cs="Arial"/>
+                <w:sz w:val="20"/>
+                <w:szCs w:val="20"/>
+              </w:rPr>
+              <w:t>O trabalho em equipe foi organizado com Git e GitHub, com ramificações por funcionalidade e revisão por pull request. Por fim, foram realizados testes de navegação e de fluxo em cada perfil, além de testes de integração automatizados para o módulo do fornecedor, que serviram de base para ajustes na interface e nas regras da API.</w:t>
             </w:r>
           </w:p>
         </w:tc>
@@ -2187,7 +2367,129 @@
                 <w:sz w:val="20"/>
                 <w:szCs w:val="20"/>
               </w:rPr>
-              <w:t>Espera-se que o protótipo TicketLab demonstre uma forma mais organizada de conectar organizadores de eventos, fornecedores e administradores em uma única plataforma. A navegação intuitiva e a separação das funcionalidades por perfil poderão facilitar o acesso às informações e reduzir dificuldades de utilização. Além disso, o projeto poderá contribuir para a inclusão digital ao considerar uma interface simples e acessível. Espera-se também que os testes permitam identificar melhorias antes de uma futura implementação completa do sistema.</w:t>
+              <w:t>O projeto resultou na plataforma TicketLab, composta por interface web, API REST e banco de dados MySQL, com login por e-mail e senha e acesso separado por perfil:</w:t>
+            </w:r>
+          </w:p>
+          <w:p>
+            <w:pPr>
+              <w:spacing w:after="0" w:line="240" w:lineRule="auto"/>
+              <w:jc w:val="both"/>
+              <w:rPr>
+                <w:rFonts w:ascii="Arial" w:eastAsia="Arial" w:hAnsi="Arial" w:cs="Arial"/>
+                <w:sz w:val="20"/>
+                <w:szCs w:val="20"/>
+              </w:rPr>
+            </w:pPr>
+            <w:r>
+              <w:rPr>
+                <w:rFonts w:ascii="Arial" w:eastAsia="Arial" w:hAnsi="Arial" w:cs="Arial"/>
+                <w:b/>
+                <w:sz w:val="20"/>
+                <w:szCs w:val="20"/>
+              </w:rPr>
+              <w:t xml:space="preserve">Administrador: </w:t>
+            </w:r>
+            <w:r>
+              <w:rPr>
+                <w:rFonts w:ascii="Arial" w:eastAsia="Arial" w:hAnsi="Arial" w:cs="Arial"/>
+                <w:sz w:val="20"/>
+                <w:szCs w:val="20"/>
+              </w:rPr>
+              <w:t>painel com indicadores, aprovação ou rejeição de cadastros, listagem de usuários, acompanhamento de eventos, relatórios com exportação em CSV e tela de conta.</w:t>
+            </w:r>
+          </w:p>
+          <w:p>
+            <w:pPr>
+              <w:spacing w:after="0" w:line="240" w:lineRule="auto"/>
+              <w:jc w:val="both"/>
+              <w:rPr>
+                <w:rFonts w:ascii="Arial" w:eastAsia="Arial" w:hAnsi="Arial" w:cs="Arial"/>
+                <w:sz w:val="20"/>
+                <w:szCs w:val="20"/>
+              </w:rPr>
+            </w:pPr>
+            <w:r>
+              <w:rPr>
+                <w:rFonts w:ascii="Arial" w:eastAsia="Arial" w:hAnsi="Arial" w:cs="Arial"/>
+                <w:b/>
+                <w:sz w:val="20"/>
+                <w:szCs w:val="20"/>
+              </w:rPr>
+              <w:t xml:space="preserve">Organizador: </w:t>
+            </w:r>
+            <w:r>
+              <w:rPr>
+                <w:rFonts w:ascii="Arial" w:eastAsia="Arial" w:hAnsi="Arial" w:cs="Arial"/>
+                <w:sz w:val="20"/>
+                <w:szCs w:val="20"/>
+              </w:rPr>
+              <w:t>cadastro e consulta de eventos, painel inicial, cálculo do valor do ingresso e telas de busca de serviços, cotações e resumo de custos.</w:t>
+            </w:r>
+          </w:p>
+          <w:p>
+            <w:pPr>
+              <w:spacing w:after="0" w:line="240" w:lineRule="auto"/>
+              <w:jc w:val="both"/>
+              <w:rPr>
+                <w:rFonts w:ascii="Arial" w:eastAsia="Arial" w:hAnsi="Arial" w:cs="Arial"/>
+                <w:sz w:val="20"/>
+                <w:szCs w:val="20"/>
+              </w:rPr>
+            </w:pPr>
+            <w:r>
+              <w:rPr>
+                <w:rFonts w:ascii="Arial" w:eastAsia="Arial" w:hAnsi="Arial" w:cs="Arial"/>
+                <w:b/>
+                <w:sz w:val="20"/>
+                <w:szCs w:val="20"/>
+              </w:rPr>
+              <w:t xml:space="preserve">Fornecedor: </w:t>
+            </w:r>
+            <w:r>
+              <w:rPr>
+                <w:rFonts w:ascii="Arial" w:eastAsia="Arial" w:hAnsi="Arial" w:cs="Arial"/>
+                <w:sz w:val="20"/>
+                <w:szCs w:val="20"/>
+              </w:rPr>
+              <w:t>painel, cadastro e edição de serviços com faixa de preço, consulta de oportunidades (eventos em planejamento), envio e retirada de propostas e tela de conta.</w:t>
+            </w:r>
+          </w:p>
+          <w:p>
+            <w:pPr>
+              <w:spacing w:after="0" w:line="240" w:lineRule="auto"/>
+              <w:jc w:val="both"/>
+              <w:rPr>
+                <w:rFonts w:ascii="Arial" w:eastAsia="Arial" w:hAnsi="Arial" w:cs="Arial"/>
+                <w:sz w:val="20"/>
+                <w:szCs w:val="20"/>
+              </w:rPr>
+            </w:pPr>
+            <w:r>
+              <w:rPr>
+                <w:rFonts w:ascii="Arial" w:eastAsia="Arial" w:hAnsi="Arial" w:cs="Arial"/>
+                <w:sz w:val="20"/>
+                <w:szCs w:val="20"/>
+              </w:rPr>
+              <w:t>Os cadastros de organizadores e fornecedores ficam pendentes até a análise do administrador, e apenas usuários aprovados conseguem entrar no sistema.</w:t>
+            </w:r>
+          </w:p>
+          <w:p>
+            <w:pPr>
+              <w:spacing w:after="0" w:line="240" w:lineRule="auto"/>
+              <w:jc w:val="both"/>
+              <w:rPr>
+                <w:rFonts w:ascii="Arial" w:eastAsia="Arial" w:hAnsi="Arial" w:cs="Arial"/>
+                <w:sz w:val="20"/>
+                <w:szCs w:val="20"/>
+              </w:rPr>
+            </w:pPr>
+            <w:r>
+              <w:rPr>
+                <w:rFonts w:ascii="Arial" w:eastAsia="Arial" w:hAnsi="Arial" w:cs="Arial"/>
+                <w:sz w:val="20"/>
+                <w:szCs w:val="20"/>
+              </w:rPr>
+              <w:t>Com isso, o projeto demonstra uma forma mais organizada de conectar organizadores, fornecedores e administradores em uma única plataforma. A separação das funcionalidades por perfil e a centralização dos dados facilitam o acesso às informações, e a interface simples contribui para a inclusão digital.</w:t>
             </w:r>
           </w:p>
         </w:tc>
@@ -2262,7 +2564,85 @@
                 <w:sz w:val="20"/>
                 <w:szCs w:val="20"/>
               </w:rPr>
-              <w:t>O projeto TicketLab propõe uma solução tecnológica para facilitar a organização e o gerenciamento de informações relacionadas a eventos. Por meio do desenvolvimento de um protótipo navegável, busca-se demonstrar a viabilidade de reunir diferentes perfis de usuários em uma plataforma com funcionalidades específicas e navegação intuitiva. A proposta atende aos objetivos de representar os principais fluxos do sistema e avaliar sua utilização, contribuindo para identificar possíveis melhorias. Como perspectiva futura, o projeto poderá evoluir para uma aplicação completa, com banco de dados, autenticação de usuários e funcionalidades operacionais.</w:t>
+              <w:t>O projeto TicketLab entregou uma solução tecnológica para facilitar a organização e o gerenciamento de informações relacionadas a eventos, reunindo administradores, organizadores e fornecedores em uma plataforma com banco de dados, API e autenticação por perfil. Os objetivos propostos foram atendidos: cadastro e aprovação de usuários, gestão de eventos, consulta de oportunidades</w:t>
+            </w:r>
+            <w:r>
+              <w:rPr>
+                <w:rFonts w:ascii="Arial" w:eastAsia="Arial" w:hAnsi="Arial" w:cs="Arial"/>
+                <w:sz w:val="20"/>
+                <w:szCs w:val="20"/>
+              </w:rPr>
+              <w:t>,</w:t>
+            </w:r>
+            <w:r>
+              <w:rPr>
+                <w:rFonts w:ascii="Arial" w:eastAsia="Arial" w:hAnsi="Arial" w:cs="Arial"/>
+                <w:sz w:val="20"/>
+                <w:szCs w:val="20"/>
+              </w:rPr>
+              <w:t xml:space="preserve"> envio de propostas pelos fornecedores e estimativa do valor do ingresso.</w:t>
+            </w:r>
+          </w:p>
+          <w:p>
+            <w:pPr>
+              <w:tabs>
+                <w:tab w:val="left" w:pos="360"/>
+              </w:tabs>
+              <w:spacing w:after="0" w:line="240" w:lineRule="auto"/>
+              <w:jc w:val="both"/>
+              <w:rPr>
+                <w:rFonts w:ascii="Arial" w:eastAsia="Arial" w:hAnsi="Arial" w:cs="Arial"/>
+                <w:sz w:val="20"/>
+                <w:szCs w:val="20"/>
+              </w:rPr>
+            </w:pPr>
+            <w:r>
+              <w:rPr>
+                <w:rFonts w:ascii="Arial" w:eastAsia="Arial" w:hAnsi="Arial" w:cs="Arial"/>
+                <w:sz w:val="20"/>
+                <w:szCs w:val="20"/>
+              </w:rPr>
+              <w:t>Como perspectivas futuras, o TicketLab pode evoluir para a venda de ingressos com integração a meios de pagamento. Também podem ser incluídos mensagens entre organizadores e fornecedores, avaliação de fornecedores após o evento</w:t>
+            </w:r>
+            <w:r>
+              <w:rPr>
+                <w:rFonts w:ascii="Arial" w:eastAsia="Arial" w:hAnsi="Arial" w:cs="Arial"/>
+                <w:sz w:val="20"/>
+                <w:szCs w:val="20"/>
+              </w:rPr>
+              <w:t>,</w:t>
+            </w:r>
+            <w:r>
+              <w:rPr>
+                <w:rFonts w:ascii="Arial" w:eastAsia="Arial" w:hAnsi="Arial" w:cs="Arial"/>
+                <w:sz w:val="20"/>
+                <w:szCs w:val="20"/>
+              </w:rPr>
+              <w:t xml:space="preserve"> notificações por e-mail sobre propostas e aprovações</w:t>
+            </w:r>
+            <w:r>
+              <w:rPr>
+                <w:rFonts w:ascii="Arial" w:eastAsia="Arial" w:hAnsi="Arial" w:cs="Arial"/>
+                <w:sz w:val="20"/>
+                <w:szCs w:val="20"/>
+              </w:rPr>
+              <w:t xml:space="preserve"> e </w:t>
+            </w:r>
+            <w:r>
+              <w:rPr>
+                <w:rFonts w:ascii="Arial" w:eastAsia="Arial" w:hAnsi="Arial" w:cs="Arial"/>
+                <w:sz w:val="20"/>
+                <w:szCs w:val="20"/>
+              </w:rPr>
+              <w:t>recomendação de fornecedores com base no histórico de eventos</w:t>
+            </w:r>
+            <w:r>
+              <w:rPr>
+                <w:rFonts w:ascii="Arial" w:eastAsia="Arial" w:hAnsi="Arial" w:cs="Arial"/>
+                <w:sz w:val="20"/>
+                <w:szCs w:val="20"/>
+              </w:rPr>
+              <w:t>.</w:t>
             </w:r>
           </w:p>
         </w:tc>
@@ -2530,6 +2910,7 @@
           <w:sz w:val="20"/>
           <w:szCs w:val="20"/>
         </w:rPr>
+        <w:lastRenderedPageBreak/>
         <w:t>ANEXO I</w:t>
       </w:r>
     </w:p>
@@ -2574,7 +2955,6 @@
                 <w:rFonts w:ascii="Arial" w:eastAsia="Arial" w:hAnsi="Arial" w:cs="Arial"/>
                 <w:sz w:val="20"/>
                 <w:szCs w:val="20"/>
-                <w:highlight w:val="white"/>
               </w:rPr>
             </w:pPr>
             <w:r>
@@ -2595,7 +2975,26 @@
                 <w:szCs w:val="20"/>
                 <w:highlight w:val="white"/>
               </w:rPr>
-              <w:t xml:space="preserve"> Protótipo navegável da plataforma TicketLab</w:t>
+              <w:t xml:space="preserve"> Plataforma web </w:t>
+            </w:r>
+            <w:proofErr w:type="spellStart"/>
+            <w:r>
+              <w:rPr>
+                <w:rFonts w:ascii="Arial" w:eastAsia="Arial" w:hAnsi="Arial" w:cs="Arial"/>
+                <w:sz w:val="20"/>
+                <w:szCs w:val="20"/>
+                <w:highlight w:val="white"/>
+              </w:rPr>
+              <w:t>TicketLab</w:t>
+            </w:r>
+            <w:proofErr w:type="spellEnd"/>
+            <w:r>
+              <w:rPr>
+                <w:rFonts w:ascii="Arial" w:eastAsia="Arial" w:hAnsi="Arial" w:cs="Arial"/>
+                <w:sz w:val="20"/>
+                <w:szCs w:val="20"/>
+              </w:rPr>
+              <w:t>.</w:t>
             </w:r>
           </w:p>
           <w:p>
@@ -2855,7 +3254,6 @@
           <w:sz w:val="20"/>
           <w:szCs w:val="20"/>
         </w:rPr>
-        <w:lastRenderedPageBreak/>
         <w:t xml:space="preserve">Versão </w:t>
       </w:r>
       <w:r>
@@ -4156,7 +4554,6 @@
   <w:style w:type="character" w:default="1" w:styleId="Fontepargpadro">
     <w:name w:val="Default Paragraph Font"/>
     <w:uiPriority w:val="1"/>
-    <w:semiHidden/>
     <w:unhideWhenUsed/>
   </w:style>
   <w:style w:type="table" w:default="1" w:styleId="Tabelanormal">
@@ -4868,17 +5265,6 @@
 </file>
 
 <file path=customXml/item1.xml><?xml version="1.0" encoding="utf-8"?>
-<p:properties xmlns:p="http://schemas.microsoft.com/office/2006/metadata/properties" xmlns:xsi="http://www.w3.org/2001/XMLSchema-instance" xmlns:pc="http://schemas.microsoft.com/office/infopath/2007/PartnerControls">
-  <documentManagement>
-    <lcf76f155ced4ddcb4097134ff3c332f xmlns="8ca2a57e-8138-4b57-956a-eb6e2c7049cc">
-      <Terms xmlns="http://schemas.microsoft.com/office/infopath/2007/PartnerControls"/>
-    </lcf76f155ced4ddcb4097134ff3c332f>
-    <TaxCatchAll xmlns="1d2798d9-1030-4cc5-be7b-200f9e628651" xsi:nil="true"/>
-  </documentManagement>
-</p:properties>
-</file>
-
-<file path=customXml/item2.xml><?xml version="1.0" encoding="utf-8"?>
 <?mso-contentType ?>
 <FormTemplates xmlns="http://schemas.microsoft.com/sharepoint/v3/contenttype/forms">
   <Display>DocumentLibraryForm</Display>
@@ -4887,7 +5273,7 @@
 </FormTemplates>
 </file>
 
-<file path=customXml/item3.xml><?xml version="1.0" encoding="utf-8"?>
+<file path=customXml/item2.xml><?xml version="1.0" encoding="utf-8"?>
 <ct:contentTypeSchema xmlns:ct="http://schemas.microsoft.com/office/2006/metadata/contentType" xmlns:ma="http://schemas.microsoft.com/office/2006/metadata/properties/metaAttributes" ct:_="" ma:_="" ma:contentTypeName="Documento" ma:contentTypeID="0x01010045364877AF745B4281652B53F43C594A" ma:contentTypeVersion="15" ma:contentTypeDescription="Crie um novo documento." ma:contentTypeScope="" ma:versionID="d0aca78f0edc9854d9577b32f48b226a">
   <xsd:schema xmlns:xsd="http://www.w3.org/2001/XMLSchema" xmlns:xs="http://www.w3.org/2001/XMLSchema" xmlns:p="http://schemas.microsoft.com/office/2006/metadata/properties" xmlns:ns2="1d2798d9-1030-4cc5-be7b-200f9e628651" xmlns:ns3="8ca2a57e-8138-4b57-956a-eb6e2c7049cc" targetNamespace="http://schemas.microsoft.com/office/2006/metadata/properties" ma:root="true" ma:fieldsID="4612fc6d25e147ba50590cbb4310a89d" ns2:_="" ns3:_="">
     <xsd:import namespace="1d2798d9-1030-4cc5-be7b-200f9e628651"/>
@@ -5122,18 +5508,18 @@
 </ct:contentTypeSchema>
 </file>
 
-<file path=customXml/itemProps1.xml><?xml version="1.0" encoding="utf-8"?>
-<ds:datastoreItem xmlns:ds="http://schemas.openxmlformats.org/officeDocument/2006/customXml" ds:itemID="{F4C3DEEC-2600-444B-9739-BAA4A738EA1E}">
-  <ds:schemaRefs>
-    <ds:schemaRef ds:uri="http://schemas.microsoft.com/office/2006/metadata/properties"/>
-    <ds:schemaRef ds:uri="http://schemas.microsoft.com/office/infopath/2007/PartnerControls"/>
-    <ds:schemaRef ds:uri="8ca2a57e-8138-4b57-956a-eb6e2c7049cc"/>
-    <ds:schemaRef ds:uri="1d2798d9-1030-4cc5-be7b-200f9e628651"/>
-  </ds:schemaRefs>
-</ds:datastoreItem>
+<file path=customXml/item3.xml><?xml version="1.0" encoding="utf-8"?>
+<p:properties xmlns:p="http://schemas.microsoft.com/office/2006/metadata/properties" xmlns:xsi="http://www.w3.org/2001/XMLSchema-instance" xmlns:pc="http://schemas.microsoft.com/office/infopath/2007/PartnerControls">
+  <documentManagement>
+    <lcf76f155ced4ddcb4097134ff3c332f xmlns="8ca2a57e-8138-4b57-956a-eb6e2c7049cc">
+      <Terms xmlns="http://schemas.microsoft.com/office/infopath/2007/PartnerControls"/>
+    </lcf76f155ced4ddcb4097134ff3c332f>
+    <TaxCatchAll xmlns="1d2798d9-1030-4cc5-be7b-200f9e628651" xsi:nil="true"/>
+  </documentManagement>
+</p:properties>
 </file>
 
-<file path=customXml/itemProps2.xml><?xml version="1.0" encoding="utf-8"?>
+<file path=customXml/itemProps1.xml><?xml version="1.0" encoding="utf-8"?>
 <ds:datastoreItem xmlns:ds="http://schemas.openxmlformats.org/officeDocument/2006/customXml" ds:itemID="{48DFB5F4-52F4-4628-91A3-77FC7DBF31CA}">
   <ds:schemaRefs>
     <ds:schemaRef ds:uri="http://schemas.microsoft.com/sharepoint/v3/contenttype/forms"/>
@@ -5141,7 +5527,7 @@
 </ds:datastoreItem>
 </file>
 
-<file path=customXml/itemProps3.xml><?xml version="1.0" encoding="utf-8"?>
+<file path=customXml/itemProps2.xml><?xml version="1.0" encoding="utf-8"?>
 <ds:datastoreItem xmlns:ds="http://schemas.openxmlformats.org/officeDocument/2006/customXml" ds:itemID="{05CF8F48-FB5F-4E20-B2D4-E9A2A1F67ED6}">
   <ds:schemaRefs>
     <ds:schemaRef ds:uri="http://schemas.microsoft.com/office/2006/metadata/contentType"/>
@@ -5158,4 +5544,15 @@
     <ds:schemaRef ds:uri="http://schemas.microsoft.com/internal/obd"/>
   </ds:schemaRefs>
 </ds:datastoreItem>
+</file>
+
+<file path=customXml/itemProps3.xml><?xml version="1.0" encoding="utf-8"?>
+<ds:datastoreItem xmlns:ds="http://schemas.openxmlformats.org/officeDocument/2006/customXml" ds:itemID="{F4C3DEEC-2600-444B-9739-BAA4A738EA1E}">
+  <ds:schemaRefs>
+    <ds:schemaRef ds:uri="http://schemas.microsoft.com/office/2006/metadata/properties"/>
+    <ds:schemaRef ds:uri="http://schemas.microsoft.com/office/infopath/2007/PartnerControls"/>
+    <ds:schemaRef ds:uri="8ca2a57e-8138-4b57-956a-eb6e2c7049cc"/>
+    <ds:schemaRef ds:uri="1d2798d9-1030-4cc5-be7b-200f9e628651"/>
+  </ds:schemaRefs>
+</ds:datastoreItem>
 </file>
</xml_diff>